<commit_message>
Scripts v2: rewrite all 28 to the 7-beat structure (hook, value by 13s, two problems, false relief, solution, emotional CTA)
Co-Authored-By: Claude Opus 5.5 <noreply@anthropic.com>
Claude-Session: https://claude.ai/code/session_01MGWT4jAM6XJzkZTjXV1KZQ
</commit_message>
<xml_diff>
--- a/content/scripts/Reel-Scripts_2026-11-23_to_2026-11-29.docx
+++ b/content/scripts/Reel-Scripts_2026-11-23_to_2026-11-29.docx
@@ -20,7 +20,7 @@
           <w:sz w:val="22"/>
           <w:szCs w:val="22"/>
         </w:rPr>
-        <w:t xml:space="preserve">@ron_tamil · 7 reels · English drafts. Say them your way in Tamil/Thanglish.</w:t>
+        <w:t xml:space="preserve">@ron_tamil · 7 reels · v2 (7-beat structure) · English drafts. Say them your way in Tamil/Thanglish.</w:t>
       </w:r>
     </w:p>
     <w:p>
@@ -367,7 +367,7 @@
                 <w:sz w:val="20"/>
                 <w:szCs w:val="20"/>
               </w:rPr>
-              <w:t xml:space="preserve">~52 s</w:t>
+              <w:t xml:space="preserve">~53 s</w:t>
             </w:r>
           </w:p>
         </w:tc>
@@ -537,7 +537,7 @@
                 <w:sz w:val="20"/>
                 <w:szCs w:val="20"/>
               </w:rPr>
-              <w:t xml:space="preserve">~45 s</w:t>
+              <w:t xml:space="preserve">~51 s</w:t>
             </w:r>
           </w:p>
         </w:tc>
@@ -707,7 +707,7 @@
                 <w:sz w:val="20"/>
                 <w:szCs w:val="20"/>
               </w:rPr>
-              <w:t xml:space="preserve">~51 s</w:t>
+              <w:t xml:space="preserve">~56 s</w:t>
             </w:r>
           </w:p>
         </w:tc>
@@ -877,7 +877,7 @@
                 <w:sz w:val="20"/>
                 <w:szCs w:val="20"/>
               </w:rPr>
-              <w:t xml:space="preserve">~39 s</w:t>
+              <w:t xml:space="preserve">~50 s</w:t>
             </w:r>
           </w:p>
         </w:tc>
@@ -1047,7 +1047,7 @@
                 <w:sz w:val="20"/>
                 <w:szCs w:val="20"/>
               </w:rPr>
-              <w:t xml:space="preserve">~45 s</w:t>
+              <w:t xml:space="preserve">~47 s</w:t>
             </w:r>
           </w:p>
         </w:tc>
@@ -1217,7 +1217,7 @@
                 <w:sz w:val="20"/>
                 <w:szCs w:val="20"/>
               </w:rPr>
-              <w:t xml:space="preserve">~42 s</w:t>
+              <w:t xml:space="preserve">~38 s</w:t>
             </w:r>
           </w:p>
         </w:tc>
@@ -1387,7 +1387,7 @@
                 <w:sz w:val="20"/>
                 <w:szCs w:val="20"/>
               </w:rPr>
-              <w:t xml:space="preserve">~48 s</w:t>
+              <w:t xml:space="preserve">~49 s</w:t>
             </w:r>
           </w:p>
         </w:tc>
@@ -1427,7 +1427,7 @@
         <w:spacing w:before="300"/>
       </w:pPr>
       <w:r>
-        <w:t xml:space="preserve">How every script is built</w:t>
+        <w:t xml:space="preserve">The 7-beat structure (v2)</w:t>
       </w:r>
     </w:p>
     <w:p>
@@ -1446,14 +1446,14 @@
           <w:sz w:val="21"/>
           <w:szCs w:val="21"/>
         </w:rPr>
-        <w:t xml:space="preserve">Hook stack (0–5 s): </w:t>
+        <w:t xml:space="preserve">1 Hook (0–6 s): </w:t>
       </w:r>
       <w:r>
         <w:rPr>
           <w:sz w:val="21"/>
           <w:szCs w:val="21"/>
         </w:rPr>
-        <w:t xml:space="preserve">three short hooks over a rising sound effect, then a 2-second movie meme. The first seconds decide watch time, which Instagram treats as its top signal.</w:t>
+        <w:t xml:space="preserve">curiosity in the first 3 s (a number, a price, a known claim), then a pattern interrupt that says the opposite of what they expect. The rising SFX runs under the curiosity line and the movie meme lands on the turn.</w:t>
       </w:r>
     </w:p>
     <w:p>
@@ -1472,14 +1472,14 @@
           <w:sz w:val="21"/>
           <w:szCs w:val="21"/>
         </w:rPr>
-        <w:t xml:space="preserve">Authority (by ~12 s): </w:t>
+        <w:t xml:space="preserve">2 Value by 13 s: </w:t>
       </w:r>
       <w:r>
         <w:rPr>
           <w:sz w:val="21"/>
           <w:szCs w:val="21"/>
         </w:rPr>
-        <w:t xml:space="preserve">one line on your 8 years of training and that you read the research, so viewers trust what comes next.</w:t>
+        <w:t xml:space="preserve">one real fact with the research on screen, so the reel feels high-value early. The authority line is folded in here.</w:t>
       </w:r>
     </w:p>
     <w:p>
@@ -1498,14 +1498,14 @@
           <w:sz w:val="21"/>
           <w:szCs w:val="21"/>
         </w:rPr>
-        <w:t xml:space="preserve">Deny the obvious: </w:t>
+        <w:t xml:space="preserve">3 First problem: </w:t>
       </w:r>
       <w:r>
         <w:rPr>
           <w:sz w:val="21"/>
           <w:szCs w:val="21"/>
         </w:rPr>
-        <w:t xml:space="preserve">each script has a "So … ? No." turn, like your best-performing beginner reel, to keep people guessing.</w:t>
+        <w:t xml:space="preserve">even with that fact, they still can't act. This re-hooks them.</w:t>
       </w:r>
     </w:p>
     <w:p>
@@ -1524,14 +1524,14 @@
           <w:sz w:val="21"/>
           <w:szCs w:val="21"/>
         </w:rPr>
-        <w:t xml:space="preserve">Research on screen: </w:t>
+        <w:t xml:space="preserve">4 False relief: </w:t>
       </w:r>
       <w:r>
         <w:rPr>
           <w:sz w:val="21"/>
           <w:szCs w:val="21"/>
         </w:rPr>
-        <w:t xml:space="preserve">every study line has an [ON-SCREEN] citation. All numbers come from the checked source in the calendar.</w:t>
+        <w:t xml:space="preserve">half the fix: a small win, but not the full answer.</w:t>
       </w:r>
     </w:p>
     <w:p>
@@ -1550,14 +1550,14 @@
           <w:sz w:val="21"/>
           <w:szCs w:val="21"/>
         </w:rPr>
-        <w:t xml:space="preserve">Follow / save CTA: </w:t>
+        <w:t xml:space="preserve">5 Second, bigger problem: </w:t>
       </w:r>
       <w:r>
         <w:rPr>
           <w:sz w:val="21"/>
           <w:szCs w:val="21"/>
         </w:rPr>
-        <w:t xml:space="preserve">a reason to follow (series, weekly study breakdowns, myths busted) or to save (lists, numbers).</w:t>
+        <w:t xml:space="preserve">the loop re-opens, which keeps people watching.</w:t>
       </w:r>
     </w:p>
     <w:p>
@@ -1576,14 +1576,14 @@
           <w:sz w:val="21"/>
           <w:szCs w:val="21"/>
         </w:rPr>
-        <w:t xml:space="preserve">Share CTA with a reason (last 20–30 s): </w:t>
+        <w:t xml:space="preserve">6 Solution (~40–55 s): </w:t>
       </w:r>
       <w:r>
         <w:rPr>
           <w:sz w:val="21"/>
           <w:szCs w:val="21"/>
         </w:rPr>
-        <w:t xml:space="preserve">names who to send it to and why. Sends per reach is the signal that carries a reel to non-followers.</w:t>
+        <w:t xml:space="preserve">answers everything at once. Save prompts and link tests sit here.</w:t>
       </w:r>
     </w:p>
     <w:p>
@@ -1602,14 +1602,14 @@
           <w:sz w:val="21"/>
           <w:szCs w:val="21"/>
         </w:rPr>
-        <w:t xml:space="preserve">Link test: </w:t>
+        <w:t xml:space="preserve">7 Emotional CTA: </w:t>
       </w:r>
       <w:r>
         <w:rPr>
           <w:sz w:val="21"/>
           <w:szCs w:val="21"/>
         </w:rPr>
-        <w:t xml:space="preserve">teaching reels end with "Comment KEYWORD and I'll send you the doc". Reply by DM yourself or with an auto-DM tool; ask Claude to write the docs.</w:t>
+        <w:t xml:space="preserve">ends on hope, then a soft share ask that names who to send it to. Shares carry a reel to non-followers.</w:t>
       </w:r>
     </w:p>
     <w:p>
@@ -1628,14 +1628,66 @@
           <w:sz w:val="21"/>
           <w:szCs w:val="21"/>
         </w:rPr>
-        <w:t xml:space="preserve">Reading the scripts: </w:t>
+        <w:t xml:space="preserve">What changed from v1: </w:t>
       </w:r>
       <w:r>
         <w:rPr>
           <w:sz w:val="21"/>
           <w:szCs w:val="21"/>
         </w:rPr>
-        <w:t xml:space="preserve">plain text is spoken; [grey italics] are directions for the edit. Lines starting CHECK must be confirmed before filming.</w:t>
+        <w:t xml:space="preserve">value now lands by 13 s (v1 often reached it at 14–20 s, after a separate authority line); every script now has two problems and a false relief instead of answering the myth straight away; endings lead with hope instead of a hard ask. Facts and sources are unchanged.</w:t>
+      </w:r>
+    </w:p>
+    <w:p>
+      <w:pPr>
+        <w:pStyle w:val="ListParagraph"/>
+        <w:numPr>
+          <w:ilvl w:val="0"/>
+          <w:numId w:val="2"/>
+        </w:numPr>
+        <w:spacing w:after="60"/>
+      </w:pPr>
+      <w:r>
+        <w:rPr>
+          <w:b/>
+          <w:bCs/>
+          <w:sz w:val="21"/>
+          <w:szCs w:val="21"/>
+        </w:rPr>
+        <w:t xml:space="preserve">Link test: </w:t>
+      </w:r>
+      <w:r>
+        <w:rPr>
+          <w:sz w:val="21"/>
+          <w:szCs w:val="21"/>
+        </w:rPr>
+        <w:t xml:space="preserve">teaching reels include "Comment KEYWORD and I'll send you the doc" in the solution beat. Ask Claude to write the docs.</w:t>
+      </w:r>
+    </w:p>
+    <w:p>
+      <w:pPr>
+        <w:pStyle w:val="ListParagraph"/>
+        <w:numPr>
+          <w:ilvl w:val="0"/>
+          <w:numId w:val="2"/>
+        </w:numPr>
+        <w:spacing w:after="60"/>
+      </w:pPr>
+      <w:r>
+        <w:rPr>
+          <w:b/>
+          <w:bCs/>
+          <w:sz w:val="21"/>
+          <w:szCs w:val="21"/>
+        </w:rPr>
+        <w:t xml:space="preserve">Reading the scripts: </w:t>
+      </w:r>
+      <w:r>
+        <w:rPr>
+          <w:sz w:val="21"/>
+          <w:szCs w:val="21"/>
+        </w:rPr>
+        <w:t xml:space="preserve">plain text is spoken; [grey italics] are edit directions. Lines starting CHECK must be confirmed before filming. Timings are targets; keep every reel under 90 s in Tamil.</w:t>
       </w:r>
     </w:p>
     <w:p>
@@ -1849,7 +1901,7 @@
                 <w:sz w:val="20"/>
                 <w:szCs w:val="20"/>
               </w:rPr>
-              <w:t xml:space="preserve">~52 s spoken in English (128 words). Keep the Tamil delivery under 90 s.</w:t>
+              <w:t xml:space="preserve">~53 s spoken in English (131 words). Keep the Tamil delivery under 90 s.</w:t>
             </w:r>
           </w:p>
         </w:tc>
@@ -1915,7 +1967,7 @@
               </w:rPr>
               <w:t xml:space="preserve">  </w:t>
             </w:r>
-            <w:hyperlink w:history="1" r:id="rIdtgh8u_w4f3r_ouy8id5jh">
+            <w:hyperlink w:history="1" r:id="rIdm4y5azl2laclnb3vitfzi">
               <w:r>
                 <w:rPr>
                   <w:rStyle w:val="Hyperlink"/>
@@ -1934,7 +1986,7 @@
         <w:pBdr>
           <w:bottom w:val="single" w:color="FFE11A" w:sz="6" w:space="1"/>
         </w:pBdr>
-        <w:spacing w:after="80" w:before="200"/>
+        <w:spacing w:after="40" w:before="110"/>
       </w:pPr>
       <w:r>
         <w:rPr>
@@ -1944,16 +1996,16 @@
           <w:sz w:val="20"/>
           <w:szCs w:val="20"/>
         </w:rPr>
-        <w:t xml:space="preserve">0–5s  </w:t>
-      </w:r>
-      <w:r>
-        <w:rPr>
-          <w:b/>
-          <w:bCs/>
-          <w:sz w:val="22"/>
-          <w:szCs w:val="22"/>
-        </w:rPr>
-        <w:t xml:space="preserve">HOOK STACK</w:t>
+        <w:t xml:space="preserve">0–3s  </w:t>
+      </w:r>
+      <w:r>
+        <w:rPr>
+          <w:b/>
+          <w:bCs/>
+          <w:sz w:val="22"/>
+          <w:szCs w:val="22"/>
+        </w:rPr>
+        <w:t xml:space="preserve">1 · HOOK: CURIOSITY</w:t>
       </w:r>
       <w:r>
         <w:rPr>
@@ -1968,7 +2020,7 @@
     </w:p>
     <w:p>
       <w:pPr>
-        <w:spacing w:after="80"/>
+        <w:spacing w:after="40"/>
         <w:ind w:left="240"/>
       </w:pPr>
       <w:r>
@@ -1976,49 +2028,36 @@
           <w:i/>
           <w:iCs/>
           <w:color w:val="6B6B6B"/>
-          <w:sz w:val="19"/>
-          <w:szCs w:val="19"/>
-        </w:rPr>
-        <w:t xml:space="preserve">[Rising SFX.]</w:t>
-      </w:r>
-    </w:p>
-    <w:p>
-      <w:pPr>
-        <w:spacing w:after="80"/>
-        <w:ind w:left="240"/>
-      </w:pPr>
-      <w:r>
-        <w:rPr>
-          <w:sz w:val="24"/>
-          <w:szCs w:val="24"/>
+          <w:sz w:val="18"/>
+          <w:szCs w:val="18"/>
+        </w:rPr>
+        <w:t xml:space="preserve">[Rising SFX starts under the first word.]</w:t>
+      </w:r>
+    </w:p>
+    <w:p>
+      <w:pPr>
+        <w:spacing w:after="40"/>
+        <w:ind w:left="240"/>
+      </w:pPr>
+      <w:r>
+        <w:rPr>
+          <w:sz w:val="22"/>
+          <w:szCs w:val="22"/>
         </w:rPr>
         <w:t xml:space="preserve">Eat only between 8 and 4…</w:t>
       </w:r>
     </w:p>
     <w:p>
       <w:pPr>
-        <w:spacing w:after="80"/>
-        <w:ind w:left="240"/>
-      </w:pPr>
-      <w:r>
-        <w:rPr>
-          <w:sz w:val="24"/>
-          <w:szCs w:val="24"/>
+        <w:spacing w:after="40"/>
+        <w:ind w:left="240"/>
+      </w:pPr>
+      <w:r>
+        <w:rPr>
+          <w:sz w:val="22"/>
+          <w:szCs w:val="22"/>
         </w:rPr>
         <w:t xml:space="preserve">…and lose weight without dieting?</w:t>
-      </w:r>
-    </w:p>
-    <w:p>
-      <w:pPr>
-        <w:spacing w:after="80"/>
-        <w:ind w:left="240"/>
-      </w:pPr>
-      <w:r>
-        <w:rPr>
-          <w:sz w:val="24"/>
-          <w:szCs w:val="24"/>
-        </w:rPr>
-        <w:t xml:space="preserve">A 12-month trial tested exactly this.</w:t>
       </w:r>
     </w:p>
     <w:p>
@@ -2026,7 +2065,7 @@
         <w:pBdr>
           <w:bottom w:val="single" w:color="FFE11A" w:sz="6" w:space="1"/>
         </w:pBdr>
-        <w:spacing w:after="80" w:before="200"/>
+        <w:spacing w:after="40" w:before="110"/>
       </w:pPr>
       <w:r>
         <w:rPr>
@@ -2036,16 +2075,16 @@
           <w:sz w:val="20"/>
           <w:szCs w:val="20"/>
         </w:rPr>
-        <w:t xml:space="preserve">5–7s  </w:t>
-      </w:r>
-      <w:r>
-        <w:rPr>
-          <w:b/>
-          <w:bCs/>
-          <w:sz w:val="22"/>
-          <w:szCs w:val="22"/>
-        </w:rPr>
-        <w:t xml:space="preserve">MEME</w:t>
+        <w:t xml:space="preserve">3–6s  </w:t>
+      </w:r>
+      <w:r>
+        <w:rPr>
+          <w:b/>
+          <w:bCs/>
+          <w:sz w:val="22"/>
+          <w:szCs w:val="22"/>
+        </w:rPr>
+        <w:t xml:space="preserve">1 · HOOK: PATTERN INTERRUPT</w:t>
       </w:r>
       <w:r>
         <w:rPr>
@@ -2060,7 +2099,20 @@
     </w:p>
     <w:p>
       <w:pPr>
-        <w:spacing w:after="80"/>
+        <w:spacing w:after="40"/>
+        <w:ind w:left="240"/>
+      </w:pPr>
+      <w:r>
+        <w:rPr>
+          <w:sz w:val="22"/>
+          <w:szCs w:val="22"/>
+        </w:rPr>
+        <w:t xml:space="preserve">A 12-month trial says the clock isn't the magic.</w:t>
+      </w:r>
+    </w:p>
+    <w:p>
+      <w:pPr>
+        <w:spacing w:after="40"/>
         <w:ind w:left="240"/>
       </w:pPr>
       <w:r>
@@ -2068,10 +2120,10 @@
           <w:i/>
           <w:iCs/>
           <w:color w:val="6B6B6B"/>
-          <w:sz w:val="19"/>
-          <w:szCs w:val="19"/>
-        </w:rPr>
-        <w:t xml:space="preserve">[MEME: hungry person staring at the clock, comedy.]</w:t>
+          <w:sz w:val="18"/>
+          <w:szCs w:val="18"/>
+        </w:rPr>
+        <w:t xml:space="preserve">[MEME lands on the turn: a hungry person staring at the clock]</w:t>
       </w:r>
     </w:p>
     <w:p>
@@ -2079,7 +2131,7 @@
         <w:pBdr>
           <w:bottom w:val="single" w:color="FFE11A" w:sz="6" w:space="1"/>
         </w:pBdr>
-        <w:spacing w:after="80" w:before="200"/>
+        <w:spacing w:after="40" w:before="110"/>
       </w:pPr>
       <w:r>
         <w:rPr>
@@ -2089,16 +2141,16 @@
           <w:sz w:val="20"/>
           <w:szCs w:val="20"/>
         </w:rPr>
-        <w:t xml:space="preserve">7–12s  </w:t>
-      </w:r>
-      <w:r>
-        <w:rPr>
-          <w:b/>
-          <w:bCs/>
-          <w:sz w:val="22"/>
-          <w:szCs w:val="22"/>
-        </w:rPr>
-        <w:t xml:space="preserve">AUTHORITY</w:t>
+        <w:t xml:space="preserve">6–13s  </w:t>
+      </w:r>
+      <w:r>
+        <w:rPr>
+          <w:b/>
+          <w:bCs/>
+          <w:sz w:val="22"/>
+          <w:szCs w:val="22"/>
+        </w:rPr>
+        <w:t xml:space="preserve">2 · VALUE (real info by 13 s)</w:t>
       </w:r>
       <w:r>
         <w:rPr>
@@ -2113,15 +2165,31 @@
     </w:p>
     <w:p>
       <w:pPr>
-        <w:spacing w:after="80"/>
-        <w:ind w:left="240"/>
-      </w:pPr>
-      <w:r>
-        <w:rPr>
-          <w:sz w:val="24"/>
-          <w:szCs w:val="24"/>
-        </w:rPr>
-        <w:t xml:space="preserve">Eight years of training. Here's what the research actually says.</w:t>
+        <w:spacing w:after="40"/>
+        <w:ind w:left="240"/>
+      </w:pPr>
+      <w:r>
+        <w:rPr>
+          <w:sz w:val="22"/>
+          <w:szCs w:val="22"/>
+        </w:rPr>
+        <w:t xml:space="preserve">139 people, same calories. The 8-to-4 group lost about 8 kilos. The other group about 6.3. Not a significant difference.</w:t>
+      </w:r>
+    </w:p>
+    <w:p>
+      <w:pPr>
+        <w:spacing w:after="40"/>
+        <w:ind w:left="240"/>
+      </w:pPr>
+      <w:r>
+        <w:rPr>
+          <w:i/>
+          <w:iCs/>
+          <w:color w:val="6B6B6B"/>
+          <w:sz w:val="18"/>
+          <w:szCs w:val="18"/>
+        </w:rPr>
+        <w:t xml:space="preserve">[ON-SCREEN: Liu et al., NEJM 2022]</w:t>
       </w:r>
     </w:p>
     <w:p>
@@ -2129,7 +2197,7 @@
         <w:pBdr>
           <w:bottom w:val="single" w:color="FFE11A" w:sz="6" w:space="1"/>
         </w:pBdr>
-        <w:spacing w:after="80" w:before="200"/>
+        <w:spacing w:after="40" w:before="110"/>
       </w:pPr>
       <w:r>
         <w:rPr>
@@ -2139,97 +2207,29 @@
           <w:sz w:val="20"/>
           <w:szCs w:val="20"/>
         </w:rPr>
-        <w:t xml:space="preserve">12–48s  </w:t>
-      </w:r>
-      <w:r>
-        <w:rPr>
-          <w:b/>
-          <w:bCs/>
-          <w:sz w:val="22"/>
-          <w:szCs w:val="22"/>
-        </w:rPr>
-        <w:t xml:space="preserve">THE TRIAL</w:t>
-      </w:r>
-    </w:p>
-    <w:p>
-      <w:pPr>
-        <w:spacing w:after="80"/>
-        <w:ind w:left="240"/>
-      </w:pPr>
-      <w:r>
-        <w:rPr>
-          <w:sz w:val="24"/>
-          <w:szCs w:val="24"/>
-        </w:rPr>
-        <w:t xml:space="preserve">139 people. 12 months. Both groups ate the same calories, but one group ate only between 8 am and 4 pm.</w:t>
-      </w:r>
-    </w:p>
-    <w:p>
-      <w:pPr>
-        <w:spacing w:after="80"/>
-        <w:ind w:left="240"/>
-      </w:pPr>
-      <w:r>
-        <w:rPr>
-          <w:i/>
-          <w:iCs/>
-          <w:color w:val="6B6B6B"/>
-          <w:sz w:val="19"/>
-          <w:szCs w:val="19"/>
-        </w:rPr>
-        <w:t xml:space="preserve">[ON-SCREEN: Liu et al., NEJM 2022]</w:t>
-      </w:r>
-    </w:p>
-    <w:p>
-      <w:pPr>
-        <w:spacing w:after="80"/>
-        <w:ind w:left="240"/>
-      </w:pPr>
-      <w:r>
-        <w:rPr>
-          <w:sz w:val="24"/>
-          <w:szCs w:val="24"/>
-        </w:rPr>
-        <w:t xml:space="preserve">Result: about 8 kg versus 6.3 kg lost. And the difference wasn't statistically significant.</w:t>
-      </w:r>
-    </w:p>
-    <w:p>
-      <w:pPr>
-        <w:spacing w:after="80"/>
-        <w:ind w:left="240"/>
-      </w:pPr>
-      <w:r>
-        <w:rPr>
-          <w:sz w:val="24"/>
-          <w:szCs w:val="24"/>
-        </w:rPr>
-        <w:t xml:space="preserve">So fasting is useless? No.</w:t>
-      </w:r>
-    </w:p>
-    <w:p>
-      <w:pPr>
-        <w:spacing w:after="80"/>
-        <w:ind w:left="240"/>
-      </w:pPr>
-      <w:r>
-        <w:rPr>
-          <w:sz w:val="24"/>
-          <w:szCs w:val="24"/>
-        </w:rPr>
-        <w:t xml:space="preserve">If a time window helps you eat less, use it. If it makes you binge at night, skip it.</w:t>
-      </w:r>
-    </w:p>
-    <w:p>
-      <w:pPr>
-        <w:spacing w:after="80"/>
-        <w:ind w:left="240"/>
-      </w:pPr>
-      <w:r>
-        <w:rPr>
-          <w:sz w:val="24"/>
-          <w:szCs w:val="24"/>
-        </w:rPr>
-        <w:t xml:space="preserve">The magic was never the clock. It was the calories.</w:t>
+        <w:t xml:space="preserve">13–22s  </w:t>
+      </w:r>
+      <w:r>
+        <w:rPr>
+          <w:b/>
+          <w:bCs/>
+          <w:sz w:val="22"/>
+          <w:szCs w:val="22"/>
+        </w:rPr>
+        <w:t xml:space="preserve">3 · FIRST PROBLEM</w:t>
+      </w:r>
+    </w:p>
+    <w:p>
+      <w:pPr>
+        <w:spacing w:after="40"/>
+        <w:ind w:left="240"/>
+      </w:pPr>
+      <w:r>
+        <w:rPr>
+          <w:sz w:val="22"/>
+          <w:szCs w:val="22"/>
+        </w:rPr>
+        <w:t xml:space="preserve">Problem: so why do so many people swear it works?</w:t>
       </w:r>
     </w:p>
     <w:p>
@@ -2237,7 +2237,7 @@
         <w:pBdr>
           <w:bottom w:val="single" w:color="FFE11A" w:sz="6" w:space="1"/>
         </w:pBdr>
-        <w:spacing w:after="80" w:before="200"/>
+        <w:spacing w:after="40" w:before="110"/>
       </w:pPr>
       <w:r>
         <w:rPr>
@@ -2247,16 +2247,136 @@
           <w:sz w:val="20"/>
           <w:szCs w:val="20"/>
         </w:rPr>
-        <w:t xml:space="preserve">48–66s  </w:t>
-      </w:r>
-      <w:r>
-        <w:rPr>
-          <w:b/>
-          <w:bCs/>
-          <w:sz w:val="22"/>
-          <w:szCs w:val="22"/>
-        </w:rPr>
-        <w:t xml:space="preserve">CLOSE + SHARE</w:t>
+        <w:t xml:space="preserve">22–30s  </w:t>
+      </w:r>
+      <w:r>
+        <w:rPr>
+          <w:b/>
+          <w:bCs/>
+          <w:sz w:val="22"/>
+          <w:szCs w:val="22"/>
+        </w:rPr>
+        <w:t xml:space="preserve">4 · FALSE RELIEF (half the fix)</w:t>
+      </w:r>
+    </w:p>
+    <w:p>
+      <w:pPr>
+        <w:spacing w:after="40"/>
+        <w:ind w:left="240"/>
+      </w:pPr>
+      <w:r>
+        <w:rPr>
+          <w:sz w:val="22"/>
+          <w:szCs w:val="22"/>
+        </w:rPr>
+        <w:t xml:space="preserve">Because for some people, a time window makes eating less easier.</w:t>
+      </w:r>
+    </w:p>
+    <w:p>
+      <w:pPr>
+        <w:pBdr>
+          <w:bottom w:val="single" w:color="FFE11A" w:sz="6" w:space="1"/>
+        </w:pBdr>
+        <w:spacing w:after="40" w:before="110"/>
+      </w:pPr>
+      <w:r>
+        <w:rPr>
+          <w:b/>
+          <w:bCs/>
+          <w:color w:val="6B6B6B"/>
+          <w:sz w:val="20"/>
+          <w:szCs w:val="20"/>
+        </w:rPr>
+        <w:t xml:space="preserve">30–40s  </w:t>
+      </w:r>
+      <w:r>
+        <w:rPr>
+          <w:b/>
+          <w:bCs/>
+          <w:sz w:val="22"/>
+          <w:szCs w:val="22"/>
+        </w:rPr>
+        <w:t xml:space="preserve">5 · SECOND, BIGGER PROBLEM</w:t>
+      </w:r>
+    </w:p>
+    <w:p>
+      <w:pPr>
+        <w:spacing w:after="40"/>
+        <w:ind w:left="240"/>
+      </w:pPr>
+      <w:r>
+        <w:rPr>
+          <w:sz w:val="22"/>
+          <w:szCs w:val="22"/>
+        </w:rPr>
+        <w:t xml:space="preserve">The bigger problem: for others it backfires. Skip breakfast, then a full biryani at 11 pm.</w:t>
+      </w:r>
+    </w:p>
+    <w:p>
+      <w:pPr>
+        <w:pBdr>
+          <w:bottom w:val="single" w:color="FFE11A" w:sz="6" w:space="1"/>
+        </w:pBdr>
+        <w:spacing w:after="40" w:before="110"/>
+      </w:pPr>
+      <w:r>
+        <w:rPr>
+          <w:b/>
+          <w:bCs/>
+          <w:color w:val="6B6B6B"/>
+          <w:sz w:val="20"/>
+          <w:szCs w:val="20"/>
+        </w:rPr>
+        <w:t xml:space="preserve">40–55s  </w:t>
+      </w:r>
+      <w:r>
+        <w:rPr>
+          <w:b/>
+          <w:bCs/>
+          <w:sz w:val="22"/>
+          <w:szCs w:val="22"/>
+        </w:rPr>
+        <w:t xml:space="preserve">6 · SOLUTION (close every loop)</w:t>
+      </w:r>
+    </w:p>
+    <w:p>
+      <w:pPr>
+        <w:spacing w:after="40"/>
+        <w:ind w:left="240"/>
+      </w:pPr>
+      <w:r>
+        <w:rPr>
+          <w:sz w:val="22"/>
+          <w:szCs w:val="22"/>
+        </w:rPr>
+        <w:t xml:space="preserve">So: if a window helps you eat less, keep it. If it makes you binge, drop it. Calories decide. The clock is just a tool.</w:t>
+      </w:r>
+    </w:p>
+    <w:p>
+      <w:pPr>
+        <w:pBdr>
+          <w:bottom w:val="single" w:color="FFE11A" w:sz="6" w:space="1"/>
+        </w:pBdr>
+        <w:spacing w:after="40" w:before="110"/>
+      </w:pPr>
+      <w:r>
+        <w:rPr>
+          <w:b/>
+          <w:bCs/>
+          <w:color w:val="6B6B6B"/>
+          <w:sz w:val="20"/>
+          <w:szCs w:val="20"/>
+        </w:rPr>
+        <w:t xml:space="preserve">55–72s  </w:t>
+      </w:r>
+      <w:r>
+        <w:rPr>
+          <w:b/>
+          <w:bCs/>
+          <w:sz w:val="22"/>
+          <w:szCs w:val="22"/>
+        </w:rPr>
+        <w:t xml:space="preserve">7 · EMOTIONAL CTA (end on hope)</w:t>
       </w:r>
       <w:r>
         <w:rPr>
@@ -2271,41 +2391,28 @@
     </w:p>
     <w:p>
       <w:pPr>
-        <w:spacing w:after="80"/>
-        <w:ind w:left="240"/>
-      </w:pPr>
-      <w:r>
-        <w:rPr>
-          <w:sz w:val="24"/>
-          <w:szCs w:val="24"/>
-        </w:rPr>
-        <w:t xml:space="preserve">Comment IF if you've tried it.</w:t>
-      </w:r>
-    </w:p>
-    <w:p>
-      <w:pPr>
-        <w:spacing w:after="80"/>
-        <w:ind w:left="240"/>
-      </w:pPr>
-      <w:r>
-        <w:rPr>
-          <w:sz w:val="24"/>
-          <w:szCs w:val="24"/>
-        </w:rPr>
-        <w:t xml:space="preserve">Follow. I'll tell you what works, not what's trending.</w:t>
-      </w:r>
-    </w:p>
-    <w:p>
-      <w:pPr>
-        <w:spacing w:after="80"/>
-        <w:ind w:left="240"/>
-      </w:pPr>
-      <w:r>
-        <w:rPr>
-          <w:sz w:val="24"/>
-          <w:szCs w:val="24"/>
-        </w:rPr>
-        <w:t xml:space="preserve">Share this with the friend who skips breakfast and then eats a full biryani at 11 pm.</w:t>
+        <w:spacing w:after="40"/>
+        <w:ind w:left="240"/>
+      </w:pPr>
+      <w:r>
+        <w:rPr>
+          <w:sz w:val="22"/>
+          <w:szCs w:val="22"/>
+        </w:rPr>
+        <w:t xml:space="preserve">There's no one right way to eat. Only the way you can keep. Comment IF if you've tried it.</w:t>
+      </w:r>
+    </w:p>
+    <w:p>
+      <w:pPr>
+        <w:spacing w:after="40"/>
+        <w:ind w:left="240"/>
+      </w:pPr>
+      <w:r>
+        <w:rPr>
+          <w:sz w:val="22"/>
+          <w:szCs w:val="22"/>
+        </w:rPr>
+        <w:t xml:space="preserve">Send this to the friend who thinks fasting is magic.</w:t>
       </w:r>
     </w:p>
     <w:p>
@@ -2519,7 +2626,7 @@
                 <w:sz w:val="20"/>
                 <w:szCs w:val="20"/>
               </w:rPr>
-              <w:t xml:space="preserve">~45 s spoken in English (110 words). Keep the Tamil delivery under 90 s.</w:t>
+              <w:t xml:space="preserve">~51 s spoken in English (125 words). Keep the Tamil delivery under 90 s.</w:t>
             </w:r>
           </w:p>
         </w:tc>
@@ -2585,7 +2692,7 @@
               </w:rPr>
               <w:t xml:space="preserve">  </w:t>
             </w:r>
-            <w:hyperlink w:history="1" r:id="rIdi8tab3e5fykpkajkjhgbl">
+            <w:hyperlink w:history="1" r:id="rIdibuetfh3qnttvuodby1qd">
               <w:r>
                 <w:rPr>
                   <w:rStyle w:val="Hyperlink"/>
@@ -2603,7 +2710,7 @@
               </w:rPr>
               <w:t xml:space="preserve">   Also: </w:t>
             </w:r>
-            <w:hyperlink w:history="1" r:id="rIdz7dyobav8hol0smqr0qv3">
+            <w:hyperlink w:history="1" r:id="rId_o9ml0kqv6izigrllnqfo">
               <w:r>
                 <w:rPr>
                   <w:rStyle w:val="Hyperlink"/>
@@ -2622,7 +2729,7 @@
         <w:pBdr>
           <w:bottom w:val="single" w:color="FFE11A" w:sz="6" w:space="1"/>
         </w:pBdr>
-        <w:spacing w:after="80" w:before="200"/>
+        <w:spacing w:after="40" w:before="110"/>
       </w:pPr>
       <w:r>
         <w:rPr>
@@ -2632,16 +2739,16 @@
           <w:sz w:val="20"/>
           <w:szCs w:val="20"/>
         </w:rPr>
-        <w:t xml:space="preserve">0–5s  </w:t>
-      </w:r>
-      <w:r>
-        <w:rPr>
-          <w:b/>
-          <w:bCs/>
-          <w:sz w:val="22"/>
-          <w:szCs w:val="22"/>
-        </w:rPr>
-        <w:t xml:space="preserve">HOOK STACK</w:t>
+        <w:t xml:space="preserve">0–3s  </w:t>
+      </w:r>
+      <w:r>
+        <w:rPr>
+          <w:b/>
+          <w:bCs/>
+          <w:sz w:val="22"/>
+          <w:szCs w:val="22"/>
+        </w:rPr>
+        <w:t xml:space="preserve">1 · HOOK: CURIOSITY</w:t>
       </w:r>
       <w:r>
         <w:rPr>
@@ -2656,7 +2763,7 @@
     </w:p>
     <w:p>
       <w:pPr>
-        <w:spacing w:after="80"/>
+        <w:spacing w:after="40"/>
         <w:ind w:left="240"/>
       </w:pPr>
       <w:r>
@@ -2664,49 +2771,23 @@
           <w:i/>
           <w:iCs/>
           <w:color w:val="6B6B6B"/>
-          <w:sz w:val="19"/>
-          <w:szCs w:val="19"/>
-        </w:rPr>
-        <w:t xml:space="preserve">[Rising SFX.]</w:t>
-      </w:r>
-    </w:p>
-    <w:p>
-      <w:pPr>
-        <w:spacing w:after="80"/>
-        <w:ind w:left="240"/>
-      </w:pPr>
-      <w:r>
-        <w:rPr>
-          <w:sz w:val="24"/>
-          <w:szCs w:val="24"/>
+          <w:sz w:val="18"/>
+          <w:szCs w:val="18"/>
+        </w:rPr>
+        <w:t xml:space="preserve">[Rising SFX starts under the first word.]</w:t>
+      </w:r>
+    </w:p>
+    <w:p>
+      <w:pPr>
+        <w:spacing w:after="40"/>
+        <w:ind w:left="240"/>
+      </w:pPr>
+      <w:r>
+        <w:rPr>
+          <w:sz w:val="22"/>
+          <w:szCs w:val="22"/>
         </w:rPr>
         <w:t xml:space="preserve">Monday: international chest day.</w:t>
-      </w:r>
-    </w:p>
-    <w:p>
-      <w:pPr>
-        <w:spacing w:after="80"/>
-        <w:ind w:left="240"/>
-      </w:pPr>
-      <w:r>
-        <w:rPr>
-          <w:sz w:val="24"/>
-          <w:szCs w:val="24"/>
-        </w:rPr>
-        <w:t xml:space="preserve">Next chest day: next Monday.</w:t>
-      </w:r>
-    </w:p>
-    <w:p>
-      <w:pPr>
-        <w:spacing w:after="80"/>
-        <w:ind w:left="240"/>
-      </w:pPr>
-      <w:r>
-        <w:rPr>
-          <w:sz w:val="24"/>
-          <w:szCs w:val="24"/>
-        </w:rPr>
-        <w:t xml:space="preserve">Your chest is waiting too long.</w:t>
       </w:r>
     </w:p>
     <w:p>
@@ -2714,7 +2795,7 @@
         <w:pBdr>
           <w:bottom w:val="single" w:color="FFE11A" w:sz="6" w:space="1"/>
         </w:pBdr>
-        <w:spacing w:after="80" w:before="200"/>
+        <w:spacing w:after="40" w:before="110"/>
       </w:pPr>
       <w:r>
         <w:rPr>
@@ -2724,16 +2805,16 @@
           <w:sz w:val="20"/>
           <w:szCs w:val="20"/>
         </w:rPr>
-        <w:t xml:space="preserve">5–7s  </w:t>
-      </w:r>
-      <w:r>
-        <w:rPr>
-          <w:b/>
-          <w:bCs/>
-          <w:sz w:val="22"/>
-          <w:szCs w:val="22"/>
-        </w:rPr>
-        <w:t xml:space="preserve">MEME</w:t>
+        <w:t xml:space="preserve">3–6s  </w:t>
+      </w:r>
+      <w:r>
+        <w:rPr>
+          <w:b/>
+          <w:bCs/>
+          <w:sz w:val="22"/>
+          <w:szCs w:val="22"/>
+        </w:rPr>
+        <w:t xml:space="preserve">1 · HOOK: PATTERN INTERRUPT</w:t>
       </w:r>
       <w:r>
         <w:rPr>
@@ -2748,7 +2829,20 @@
     </w:p>
     <w:p>
       <w:pPr>
-        <w:spacing w:after="80"/>
+        <w:spacing w:after="40"/>
+        <w:ind w:left="240"/>
+      </w:pPr>
+      <w:r>
+        <w:rPr>
+          <w:sz w:val="22"/>
+          <w:szCs w:val="22"/>
+        </w:rPr>
+        <w:t xml:space="preserve">And your chest waits seven days for the next one.</w:t>
+      </w:r>
+    </w:p>
+    <w:p>
+      <w:pPr>
+        <w:spacing w:after="40"/>
         <w:ind w:left="240"/>
       </w:pPr>
       <w:r>
@@ -2756,10 +2850,10 @@
           <w:i/>
           <w:iCs/>
           <w:color w:val="6B6B6B"/>
-          <w:sz w:val="19"/>
-          <w:szCs w:val="19"/>
-        </w:rPr>
-        <w:t xml:space="preserve">[MEME: queue at the bench press on Monday, comedy.]</w:t>
+          <w:sz w:val="18"/>
+          <w:szCs w:val="18"/>
+        </w:rPr>
+        <w:t xml:space="preserve">[MEME lands on the turn: a Monday queue at the bench press]</w:t>
       </w:r>
     </w:p>
     <w:p>
@@ -2767,7 +2861,7 @@
         <w:pBdr>
           <w:bottom w:val="single" w:color="FFE11A" w:sz="6" w:space="1"/>
         </w:pBdr>
-        <w:spacing w:after="80" w:before="200"/>
+        <w:spacing w:after="40" w:before="110"/>
       </w:pPr>
       <w:r>
         <w:rPr>
@@ -2777,16 +2871,16 @@
           <w:sz w:val="20"/>
           <w:szCs w:val="20"/>
         </w:rPr>
-        <w:t xml:space="preserve">7–12s  </w:t>
-      </w:r>
-      <w:r>
-        <w:rPr>
-          <w:b/>
-          <w:bCs/>
-          <w:sz w:val="22"/>
-          <w:szCs w:val="22"/>
-        </w:rPr>
-        <w:t xml:space="preserve">AUTHORITY</w:t>
+        <w:t xml:space="preserve">6–13s  </w:t>
+      </w:r>
+      <w:r>
+        <w:rPr>
+          <w:b/>
+          <w:bCs/>
+          <w:sz w:val="22"/>
+          <w:szCs w:val="22"/>
+        </w:rPr>
+        <w:t xml:space="preserve">2 · VALUE (real info by 13 s)</w:t>
       </w:r>
       <w:r>
         <w:rPr>
@@ -2801,15 +2895,31 @@
     </w:p>
     <w:p>
       <w:pPr>
-        <w:spacing w:after="80"/>
-        <w:ind w:left="240"/>
-      </w:pPr>
-      <w:r>
-        <w:rPr>
-          <w:sz w:val="24"/>
-          <w:szCs w:val="24"/>
-        </w:rPr>
-        <w:t xml:space="preserve">Every Tuesday, one study. This one is about your split.</w:t>
+        <w:spacing w:after="40"/>
+        <w:ind w:left="240"/>
+      </w:pPr>
+      <w:r>
+        <w:rPr>
+          <w:sz w:val="22"/>
+          <w:szCs w:val="22"/>
+        </w:rPr>
+        <w:t xml:space="preserve">A 2016 meta-analysis: with the same weekly sets, training a muscle twice a week beat once a week for growth.</w:t>
+      </w:r>
+    </w:p>
+    <w:p>
+      <w:pPr>
+        <w:spacing w:after="40"/>
+        <w:ind w:left="240"/>
+      </w:pPr>
+      <w:r>
+        <w:rPr>
+          <w:i/>
+          <w:iCs/>
+          <w:color w:val="6B6B6B"/>
+          <w:sz w:val="18"/>
+          <w:szCs w:val="18"/>
+        </w:rPr>
+        <w:t xml:space="preserve">[ON-SCREEN: Schoenfeld et al., Sports Medicine 2016]</w:t>
       </w:r>
     </w:p>
     <w:p>
@@ -2817,7 +2927,7 @@
         <w:pBdr>
           <w:bottom w:val="single" w:color="FFE11A" w:sz="6" w:space="1"/>
         </w:pBdr>
-        <w:spacing w:after="80" w:before="200"/>
+        <w:spacing w:after="40" w:before="110"/>
       </w:pPr>
       <w:r>
         <w:rPr>
@@ -2827,100 +2937,29 @@
           <w:sz w:val="20"/>
           <w:szCs w:val="20"/>
         </w:rPr>
-        <w:t xml:space="preserve">12–50s  </w:t>
-      </w:r>
-      <w:r>
-        <w:rPr>
-          <w:b/>
-          <w:bCs/>
-          <w:sz w:val="22"/>
-          <w:szCs w:val="22"/>
-        </w:rPr>
-        <w:t xml:space="preserve">THE RESEARCH</w:t>
-      </w:r>
-    </w:p>
-    <w:p>
-      <w:pPr>
-        <w:spacing w:after="80"/>
-        <w:ind w:left="240"/>
-      </w:pPr>
-      <w:r>
-        <w:rPr>
-          <w:sz w:val="24"/>
-          <w:szCs w:val="24"/>
-        </w:rPr>
-        <w:t xml:space="preserve">A 2016 meta-analysis: when weekly sets were the same, training a muscle twice a week beat once a week for growth.</w:t>
-      </w:r>
-    </w:p>
-    <w:p>
-      <w:pPr>
-        <w:spacing w:after="80"/>
-        <w:ind w:left="240"/>
-      </w:pPr>
-      <w:r>
-        <w:rPr>
-          <w:i/>
-          <w:iCs/>
-          <w:color w:val="6B6B6B"/>
-          <w:sz w:val="19"/>
-          <w:szCs w:val="19"/>
-        </w:rPr>
-        <w:t xml:space="preserve">[ON-SCREEN: Schoenfeld et al., Sports Medicine 2016]</w:t>
-      </w:r>
-    </w:p>
-    <w:p>
-      <w:pPr>
-        <w:spacing w:after="80"/>
-        <w:ind w:left="240"/>
-      </w:pPr>
-      <w:r>
-        <w:rPr>
-          <w:sz w:val="24"/>
-          <w:szCs w:val="24"/>
-        </w:rPr>
-        <w:t xml:space="preserve">So train every muscle every day? No.</w:t>
-      </w:r>
-    </w:p>
-    <w:p>
-      <w:pPr>
-        <w:spacing w:after="80"/>
-        <w:ind w:left="240"/>
-      </w:pPr>
-      <w:r>
-        <w:rPr>
-          <w:sz w:val="24"/>
-          <w:szCs w:val="24"/>
-        </w:rPr>
-        <w:t xml:space="preserve">Newer research suggests total weekly sets matter most. Training twice a week mainly helps you spread those sets so each one is good quality.</w:t>
-      </w:r>
-    </w:p>
-    <w:p>
-      <w:pPr>
-        <w:spacing w:after="80"/>
-        <w:ind w:left="240"/>
-      </w:pPr>
-      <w:r>
-        <w:rPr>
-          <w:i/>
-          <w:iCs/>
-          <w:color w:val="6B6B6B"/>
-          <w:sz w:val="19"/>
-          <w:szCs w:val="19"/>
-        </w:rPr>
-        <w:t xml:space="preserve">[ON-SCREEN: 2025 meta-regression, volume &amp; frequency]</w:t>
-      </w:r>
-    </w:p>
-    <w:p>
-      <w:pPr>
-        <w:spacing w:after="80"/>
-        <w:ind w:left="240"/>
-      </w:pPr>
-      <w:r>
-        <w:rPr>
-          <w:sz w:val="24"/>
-          <w:szCs w:val="24"/>
-        </w:rPr>
-        <w:t xml:space="preserve">Practical: upper-lower or full-body, hitting each muscle at least twice a week.</w:t>
+        <w:t xml:space="preserve">13–22s  </w:t>
+      </w:r>
+      <w:r>
+        <w:rPr>
+          <w:b/>
+          <w:bCs/>
+          <w:sz w:val="22"/>
+          <w:szCs w:val="22"/>
+        </w:rPr>
+        <w:t xml:space="preserve">3 · FIRST PROBLEM</w:t>
+      </w:r>
+    </w:p>
+    <w:p>
+      <w:pPr>
+        <w:spacing w:after="40"/>
+        <w:ind w:left="240"/>
+      </w:pPr>
+      <w:r>
+        <w:rPr>
+          <w:sz w:val="22"/>
+          <w:szCs w:val="22"/>
+        </w:rPr>
+        <w:t xml:space="preserve">Problem: twice a week on a bro split means more gym days than you have.</w:t>
       </w:r>
     </w:p>
     <w:p>
@@ -2928,7 +2967,7 @@
         <w:pBdr>
           <w:bottom w:val="single" w:color="FFE11A" w:sz="6" w:space="1"/>
         </w:pBdr>
-        <w:spacing w:after="80" w:before="200"/>
+        <w:spacing w:after="40" w:before="110"/>
       </w:pPr>
       <w:r>
         <w:rPr>
@@ -2938,29 +2977,29 @@
           <w:sz w:val="20"/>
           <w:szCs w:val="20"/>
         </w:rPr>
-        <w:t xml:space="preserve">50–56s  </w:t>
-      </w:r>
-      <w:r>
-        <w:rPr>
-          <w:b/>
-          <w:bCs/>
-          <w:sz w:val="22"/>
-          <w:szCs w:val="22"/>
-        </w:rPr>
-        <w:t xml:space="preserve">FOLLOW CTA</w:t>
-      </w:r>
-    </w:p>
-    <w:p>
-      <w:pPr>
-        <w:spacing w:after="80"/>
-        <w:ind w:left="240"/>
-      </w:pPr>
-      <w:r>
-        <w:rPr>
-          <w:sz w:val="24"/>
-          <w:szCs w:val="24"/>
-        </w:rPr>
-        <w:t xml:space="preserve">One study every Tuesday. Follow.</w:t>
+        <w:t xml:space="preserve">22–30s  </w:t>
+      </w:r>
+      <w:r>
+        <w:rPr>
+          <w:b/>
+          <w:bCs/>
+          <w:sz w:val="22"/>
+          <w:szCs w:val="22"/>
+        </w:rPr>
+        <w:t xml:space="preserve">4 · FALSE RELIEF (half the fix)</w:t>
+      </w:r>
+    </w:p>
+    <w:p>
+      <w:pPr>
+        <w:spacing w:after="40"/>
+        <w:ind w:left="240"/>
+      </w:pPr>
+      <w:r>
+        <w:rPr>
+          <w:sz w:val="22"/>
+          <w:szCs w:val="22"/>
+        </w:rPr>
+        <w:t xml:space="preserve">So switch to upper-lower or full-body.</w:t>
       </w:r>
     </w:p>
     <w:p>
@@ -2968,7 +3007,7 @@
         <w:pBdr>
           <w:bottom w:val="single" w:color="FFE11A" w:sz="6" w:space="1"/>
         </w:pBdr>
-        <w:spacing w:after="80" w:before="200"/>
+        <w:spacing w:after="40" w:before="110"/>
       </w:pPr>
       <w:r>
         <w:rPr>
@@ -2978,16 +3017,112 @@
           <w:sz w:val="20"/>
           <w:szCs w:val="20"/>
         </w:rPr>
-        <w:t xml:space="preserve">56–70s  </w:t>
-      </w:r>
-      <w:r>
-        <w:rPr>
-          <w:b/>
-          <w:bCs/>
-          <w:sz w:val="22"/>
-          <w:szCs w:val="22"/>
-        </w:rPr>
-        <w:t xml:space="preserve">CLOSE + SHARE</w:t>
+        <w:t xml:space="preserve">30–40s  </w:t>
+      </w:r>
+      <w:r>
+        <w:rPr>
+          <w:b/>
+          <w:bCs/>
+          <w:sz w:val="22"/>
+          <w:szCs w:val="22"/>
+        </w:rPr>
+        <w:t xml:space="preserve">5 · SECOND, BIGGER PROBLEM</w:t>
+      </w:r>
+    </w:p>
+    <w:p>
+      <w:pPr>
+        <w:spacing w:after="40"/>
+        <w:ind w:left="240"/>
+      </w:pPr>
+      <w:r>
+        <w:rPr>
+          <w:sz w:val="22"/>
+          <w:szCs w:val="22"/>
+        </w:rPr>
+        <w:t xml:space="preserve">The bigger problem: newer research says total weekly sets matter more than frequency. Training more often won't fix too little volume.</w:t>
+      </w:r>
+    </w:p>
+    <w:p>
+      <w:pPr>
+        <w:spacing w:after="40"/>
+        <w:ind w:left="240"/>
+      </w:pPr>
+      <w:r>
+        <w:rPr>
+          <w:i/>
+          <w:iCs/>
+          <w:color w:val="6B6B6B"/>
+          <w:sz w:val="18"/>
+          <w:szCs w:val="18"/>
+        </w:rPr>
+        <w:t xml:space="preserve">[ON-SCREEN: 2025 meta-regression, volume &amp; frequency]</w:t>
+      </w:r>
+    </w:p>
+    <w:p>
+      <w:pPr>
+        <w:pBdr>
+          <w:bottom w:val="single" w:color="FFE11A" w:sz="6" w:space="1"/>
+        </w:pBdr>
+        <w:spacing w:after="40" w:before="110"/>
+      </w:pPr>
+      <w:r>
+        <w:rPr>
+          <w:b/>
+          <w:bCs/>
+          <w:color w:val="6B6B6B"/>
+          <w:sz w:val="20"/>
+          <w:szCs w:val="20"/>
+        </w:rPr>
+        <w:t xml:space="preserve">40–55s  </w:t>
+      </w:r>
+      <w:r>
+        <w:rPr>
+          <w:b/>
+          <w:bCs/>
+          <w:sz w:val="22"/>
+          <w:szCs w:val="22"/>
+        </w:rPr>
+        <w:t xml:space="preserve">6 · SOLUTION (close every loop)</w:t>
+      </w:r>
+    </w:p>
+    <w:p>
+      <w:pPr>
+        <w:spacing w:after="40"/>
+        <w:ind w:left="240"/>
+      </w:pPr>
+      <w:r>
+        <w:rPr>
+          <w:sz w:val="22"/>
+          <w:szCs w:val="22"/>
+        </w:rPr>
+        <w:t xml:space="preserve">So: first get your weekly sets right. Then spread them over two sessions per muscle, so every set is high quality.</w:t>
+      </w:r>
+    </w:p>
+    <w:p>
+      <w:pPr>
+        <w:pBdr>
+          <w:bottom w:val="single" w:color="FFE11A" w:sz="6" w:space="1"/>
+        </w:pBdr>
+        <w:spacing w:after="40" w:before="110"/>
+      </w:pPr>
+      <w:r>
+        <w:rPr>
+          <w:b/>
+          <w:bCs/>
+          <w:color w:val="6B6B6B"/>
+          <w:sz w:val="20"/>
+          <w:szCs w:val="20"/>
+        </w:rPr>
+        <w:t xml:space="preserve">55–72s  </w:t>
+      </w:r>
+      <w:r>
+        <w:rPr>
+          <w:b/>
+          <w:bCs/>
+          <w:sz w:val="22"/>
+          <w:szCs w:val="22"/>
+        </w:rPr>
+        <w:t xml:space="preserve">7 · EMOTIONAL CTA (end on hope)</w:t>
       </w:r>
       <w:r>
         <w:rPr>
@@ -3002,28 +3137,28 @@
     </w:p>
     <w:p>
       <w:pPr>
-        <w:spacing w:after="80"/>
-        <w:ind w:left="240"/>
-      </w:pPr>
-      <w:r>
-        <w:rPr>
-          <w:sz w:val="24"/>
-          <w:szCs w:val="24"/>
-        </w:rPr>
-        <w:t xml:space="preserve">Comment your split and I'll reply.</w:t>
-      </w:r>
-    </w:p>
-    <w:p>
-      <w:pPr>
-        <w:spacing w:after="80"/>
-        <w:ind w:left="240"/>
-      </w:pPr>
-      <w:r>
-        <w:rPr>
-          <w:sz w:val="24"/>
-          <w:szCs w:val="24"/>
-        </w:rPr>
-        <w:t xml:space="preserve">Share this with your bro-split buddy. No hate, just science.</w:t>
+        <w:spacing w:after="40"/>
+        <w:ind w:left="240"/>
+      </w:pPr>
+      <w:r>
+        <w:rPr>
+          <w:sz w:val="22"/>
+          <w:szCs w:val="22"/>
+        </w:rPr>
+        <w:t xml:space="preserve">The right plan makes the same effort count double. Comment your split.</w:t>
+      </w:r>
+    </w:p>
+    <w:p>
+      <w:pPr>
+        <w:spacing w:after="40"/>
+        <w:ind w:left="240"/>
+      </w:pPr>
+      <w:r>
+        <w:rPr>
+          <w:sz w:val="22"/>
+          <w:szCs w:val="22"/>
+        </w:rPr>
+        <w:t xml:space="preserve">Send this to your bro-split buddy. No hate, just science. Follow for one study every Tuesday.</w:t>
       </w:r>
     </w:p>
     <w:p>
@@ -3237,7 +3372,7 @@
                 <w:sz w:val="20"/>
                 <w:szCs w:val="20"/>
               </w:rPr>
-              <w:t xml:space="preserve">~51 s spoken in English (124 words). Keep the Tamil delivery under 90 s.</w:t>
+              <w:t xml:space="preserve">~56 s spoken in English (139 words). Keep the Tamil delivery under 90 s.</w:t>
             </w:r>
           </w:p>
         </w:tc>
@@ -3303,7 +3438,7 @@
               </w:rPr>
               <w:t xml:space="preserve">  </w:t>
             </w:r>
-            <w:hyperlink w:history="1" r:id="rIdb33hugfl07dtneruds8bs">
+            <w:hyperlink w:history="1" r:id="rIdbrjnizm18famjwxwaaa2e">
               <w:r>
                 <w:rPr>
                   <w:rStyle w:val="Hyperlink"/>
@@ -3321,7 +3456,7 @@
               </w:rPr>
               <w:t xml:space="preserve">   Also: </w:t>
             </w:r>
-            <w:hyperlink w:history="1" r:id="rIdr4s4wree7gd3ufdy8aj2c">
+            <w:hyperlink w:history="1" r:id="rIdiv8uw1g66gkgxsr5uqu4v">
               <w:r>
                 <w:rPr>
                   <w:rStyle w:val="Hyperlink"/>
@@ -3395,7 +3530,7 @@
                 <w:sz w:val="20"/>
                 <w:szCs w:val="20"/>
               </w:rPr>
-              <w:t xml:space="preserve">Fat-loss basics: deficit, protein target, weekly lifting, daily steps, and how to track the weekly average weight.</w:t>
+              <w:t xml:space="preserve">Fat-loss basics: deficit, protein target, weekly lifting, daily steps, and tracking the weekly average weight.</w:t>
             </w:r>
           </w:p>
         </w:tc>
@@ -3406,7 +3541,7 @@
         <w:pBdr>
           <w:bottom w:val="single" w:color="FFE11A" w:sz="6" w:space="1"/>
         </w:pBdr>
-        <w:spacing w:after="80" w:before="200"/>
+        <w:spacing w:after="40" w:before="110"/>
       </w:pPr>
       <w:r>
         <w:rPr>
@@ -3416,16 +3551,16 @@
           <w:sz w:val="20"/>
           <w:szCs w:val="20"/>
         </w:rPr>
-        <w:t xml:space="preserve">0–5s  </w:t>
-      </w:r>
-      <w:r>
-        <w:rPr>
-          <w:b/>
-          <w:bCs/>
-          <w:sz w:val="22"/>
-          <w:szCs w:val="22"/>
-        </w:rPr>
-        <w:t xml:space="preserve">HOOK STACK</w:t>
+        <w:t xml:space="preserve">0–3s  </w:t>
+      </w:r>
+      <w:r>
+        <w:rPr>
+          <w:b/>
+          <w:bCs/>
+          <w:sz w:val="22"/>
+          <w:szCs w:val="22"/>
+        </w:rPr>
+        <w:t xml:space="preserve">1 · HOOK: CURIOSITY</w:t>
       </w:r>
       <w:r>
         <w:rPr>
@@ -3440,7 +3575,7 @@
     </w:p>
     <w:p>
       <w:pPr>
-        <w:spacing w:after="80"/>
+        <w:spacing w:after="40"/>
         <w:ind w:left="240"/>
       </w:pPr>
       <w:r>
@@ -3448,49 +3583,36 @@
           <w:i/>
           <w:iCs/>
           <w:color w:val="6B6B6B"/>
-          <w:sz w:val="19"/>
-          <w:szCs w:val="19"/>
-        </w:rPr>
-        <w:t xml:space="preserve">[Rising SFX. Open on you, not the board.]</w:t>
-      </w:r>
-    </w:p>
-    <w:p>
-      <w:pPr>
-        <w:spacing w:after="80"/>
-        <w:ind w:left="240"/>
-      </w:pPr>
-      <w:r>
-        <w:rPr>
-          <w:sz w:val="24"/>
-          <w:szCs w:val="24"/>
+          <w:sz w:val="18"/>
+          <w:szCs w:val="18"/>
+        </w:rPr>
+        <w:t xml:space="preserve">[Rising SFX starts under the first word.]</w:t>
+      </w:r>
+    </w:p>
+    <w:p>
+      <w:pPr>
+        <w:spacing w:after="40"/>
+        <w:ind w:left="240"/>
+      </w:pPr>
+      <w:r>
+        <w:rPr>
+          <w:sz w:val="22"/>
+          <w:szCs w:val="22"/>
         </w:rPr>
         <w:t xml:space="preserve">A thousand crunches a day.</w:t>
       </w:r>
     </w:p>
     <w:p>
       <w:pPr>
-        <w:spacing w:after="80"/>
-        <w:ind w:left="240"/>
-      </w:pPr>
-      <w:r>
-        <w:rPr>
-          <w:sz w:val="24"/>
-          <w:szCs w:val="24"/>
+        <w:spacing w:after="40"/>
+        <w:ind w:left="240"/>
+      </w:pPr>
+      <w:r>
+        <w:rPr>
+          <w:sz w:val="22"/>
+          <w:szCs w:val="22"/>
         </w:rPr>
         <w:t xml:space="preserve">Sweat belt on.</w:t>
-      </w:r>
-    </w:p>
-    <w:p>
-      <w:pPr>
-        <w:spacing w:after="80"/>
-        <w:ind w:left="240"/>
-      </w:pPr>
-      <w:r>
-        <w:rPr>
-          <w:sz w:val="24"/>
-          <w:szCs w:val="24"/>
-        </w:rPr>
-        <w:t xml:space="preserve">Same belly?</w:t>
       </w:r>
     </w:p>
     <w:p>
@@ -3498,7 +3620,7 @@
         <w:pBdr>
           <w:bottom w:val="single" w:color="FFE11A" w:sz="6" w:space="1"/>
         </w:pBdr>
-        <w:spacing w:after="80" w:before="200"/>
+        <w:spacing w:after="40" w:before="110"/>
       </w:pPr>
       <w:r>
         <w:rPr>
@@ -3508,16 +3630,16 @@
           <w:sz w:val="20"/>
           <w:szCs w:val="20"/>
         </w:rPr>
-        <w:t xml:space="preserve">5–7s  </w:t>
-      </w:r>
-      <w:r>
-        <w:rPr>
-          <w:b/>
-          <w:bCs/>
-          <w:sz w:val="22"/>
-          <w:szCs w:val="22"/>
-        </w:rPr>
-        <w:t xml:space="preserve">MEME</w:t>
+        <w:t xml:space="preserve">3–6s  </w:t>
+      </w:r>
+      <w:r>
+        <w:rPr>
+          <w:b/>
+          <w:bCs/>
+          <w:sz w:val="22"/>
+          <w:szCs w:val="22"/>
+        </w:rPr>
+        <w:t xml:space="preserve">1 · HOOK: PATTERN INTERRUPT</w:t>
       </w:r>
       <w:r>
         <w:rPr>
@@ -3532,7 +3654,20 @@
     </w:p>
     <w:p>
       <w:pPr>
-        <w:spacing w:after="80"/>
+        <w:spacing w:after="40"/>
+        <w:ind w:left="240"/>
+      </w:pPr>
+      <w:r>
+        <w:rPr>
+          <w:sz w:val="22"/>
+          <w:szCs w:val="22"/>
+        </w:rPr>
+        <w:t xml:space="preserve">And the belly stays. Not because you're lazy.</w:t>
+      </w:r>
+    </w:p>
+    <w:p>
+      <w:pPr>
+        <w:spacing w:after="40"/>
         <w:ind w:left="240"/>
       </w:pPr>
       <w:r>
@@ -3540,10 +3675,10 @@
           <w:i/>
           <w:iCs/>
           <w:color w:val="6B6B6B"/>
-          <w:sz w:val="19"/>
-          <w:szCs w:val="19"/>
-        </w:rPr>
-        <w:t xml:space="preserve">[MEME: TV-shop infomercial parody of a sweat belt.]</w:t>
+          <w:sz w:val="18"/>
+          <w:szCs w:val="18"/>
+        </w:rPr>
+        <w:t xml:space="preserve">[MEME lands on the turn: a TV-shop infomercial for a sweat belt]</w:t>
       </w:r>
     </w:p>
     <w:p>
@@ -3551,7 +3686,7 @@
         <w:pBdr>
           <w:bottom w:val="single" w:color="FFE11A" w:sz="6" w:space="1"/>
         </w:pBdr>
-        <w:spacing w:after="80" w:before="200"/>
+        <w:spacing w:after="40" w:before="110"/>
       </w:pPr>
       <w:r>
         <w:rPr>
@@ -3561,16 +3696,16 @@
           <w:sz w:val="20"/>
           <w:szCs w:val="20"/>
         </w:rPr>
-        <w:t xml:space="preserve">7–12s  </w:t>
-      </w:r>
-      <w:r>
-        <w:rPr>
-          <w:b/>
-          <w:bCs/>
-          <w:sz w:val="22"/>
-          <w:szCs w:val="22"/>
-        </w:rPr>
-        <w:t xml:space="preserve">AUTHORITY</w:t>
+        <w:t xml:space="preserve">6–13s  </w:t>
+      </w:r>
+      <w:r>
+        <w:rPr>
+          <w:b/>
+          <w:bCs/>
+          <w:sz w:val="22"/>
+          <w:szCs w:val="22"/>
+        </w:rPr>
+        <w:t xml:space="preserve">2 · VALUE (real info by 13 s)</w:t>
       </w:r>
       <w:r>
         <w:rPr>
@@ -3585,15 +3720,47 @@
     </w:p>
     <w:p>
       <w:pPr>
-        <w:spacing w:after="80"/>
-        <w:ind w:left="240"/>
-      </w:pPr>
-      <w:r>
-        <w:rPr>
-          <w:sz w:val="24"/>
-          <w:szCs w:val="24"/>
-        </w:rPr>
-        <w:t xml:space="preserve">Gym Basics, episode 5. The myth that refuses to die.</w:t>
+        <w:spacing w:after="40"/>
+        <w:ind w:left="240"/>
+      </w:pPr>
+      <w:r>
+        <w:rPr>
+          <w:i/>
+          <w:iCs/>
+          <w:color w:val="6B6B6B"/>
+          <w:sz w:val="18"/>
+          <w:szCs w:val="18"/>
+        </w:rPr>
+        <w:t xml:space="preserve">[Open on you; reveal the board on 'one leg'.]</w:t>
+      </w:r>
+    </w:p>
+    <w:p>
+      <w:pPr>
+        <w:spacing w:after="40"/>
+        <w:ind w:left="240"/>
+      </w:pPr>
+      <w:r>
+        <w:rPr>
+          <w:sz w:val="22"/>
+          <w:szCs w:val="22"/>
+        </w:rPr>
+        <w:t xml:space="preserve">Gym Basics, episode 5. One study trained just one leg for 12 weeks, about a thousand reps a session. Fat came down overall, but not more in the trained leg.</w:t>
+      </w:r>
+    </w:p>
+    <w:p>
+      <w:pPr>
+        <w:spacing w:after="40"/>
+        <w:ind w:left="240"/>
+      </w:pPr>
+      <w:r>
+        <w:rPr>
+          <w:i/>
+          <w:iCs/>
+          <w:color w:val="6B6B6B"/>
+          <w:sz w:val="18"/>
+          <w:szCs w:val="18"/>
+        </w:rPr>
+        <w:t xml:space="preserve">[ON-SCREEN: Ramírez-Campillo et al., J Strength Cond Res 2013]</w:t>
       </w:r>
     </w:p>
     <w:p>
@@ -3601,7 +3768,7 @@
         <w:pBdr>
           <w:bottom w:val="single" w:color="FFE11A" w:sz="6" w:space="1"/>
         </w:pBdr>
-        <w:spacing w:after="80" w:before="200"/>
+        <w:spacing w:after="40" w:before="110"/>
       </w:pPr>
       <w:r>
         <w:rPr>
@@ -3611,100 +3778,29 @@
           <w:sz w:val="20"/>
           <w:szCs w:val="20"/>
         </w:rPr>
-        <w:t xml:space="preserve">12–55s  </w:t>
-      </w:r>
-      <w:r>
-        <w:rPr>
-          <w:b/>
-          <w:bCs/>
-          <w:sz w:val="22"/>
-          <w:szCs w:val="22"/>
-        </w:rPr>
-        <w:t xml:space="preserve">THE BOARD</w:t>
-      </w:r>
-    </w:p>
-    <w:p>
-      <w:pPr>
-        <w:spacing w:after="80"/>
-        <w:ind w:left="240"/>
-      </w:pPr>
-      <w:r>
-        <w:rPr>
-          <w:sz w:val="24"/>
-          <w:szCs w:val="24"/>
-        </w:rPr>
-        <w:t xml:space="preserve">In one study, people trained just one leg for 12 weeks, around a thousand reps a session.</w:t>
-      </w:r>
-    </w:p>
-    <w:p>
-      <w:pPr>
-        <w:spacing w:after="80"/>
-        <w:ind w:left="240"/>
-      </w:pPr>
-      <w:r>
-        <w:rPr>
-          <w:i/>
-          <w:iCs/>
-          <w:color w:val="6B6B6B"/>
-          <w:sz w:val="19"/>
-          <w:szCs w:val="19"/>
-        </w:rPr>
-        <w:t xml:space="preserve">[ON-SCREEN: Ramírez-Campillo et al., J Strength Cond Res 2013]</w:t>
-      </w:r>
-    </w:p>
-    <w:p>
-      <w:pPr>
-        <w:spacing w:after="80"/>
-        <w:ind w:left="240"/>
-      </w:pPr>
-      <w:r>
-        <w:rPr>
-          <w:sz w:val="24"/>
-          <w:szCs w:val="24"/>
-        </w:rPr>
-        <w:t xml:space="preserve">They lost body fat overall. But the trained leg didn't lose more fat than the other leg.</w:t>
-      </w:r>
-    </w:p>
-    <w:p>
-      <w:pPr>
-        <w:spacing w:after="80"/>
-        <w:ind w:left="240"/>
-      </w:pPr>
-      <w:r>
-        <w:rPr>
-          <w:sz w:val="24"/>
-          <w:szCs w:val="24"/>
-        </w:rPr>
-        <w:t xml:space="preserve">So it's settled? Honestly, not 100%. One newer study did find extra belly-fat loss from ab exercise, but it was a small study.</w:t>
-      </w:r>
-    </w:p>
-    <w:p>
-      <w:pPr>
-        <w:spacing w:after="80"/>
-        <w:ind w:left="240"/>
-      </w:pPr>
-      <w:r>
-        <w:rPr>
-          <w:sz w:val="24"/>
-          <w:szCs w:val="24"/>
-        </w:rPr>
-        <w:t xml:space="preserve">For most people, the belly goes when overall body fat goes.</w:t>
-      </w:r>
-    </w:p>
-    <w:p>
-      <w:pPr>
-        <w:spacing w:after="80"/>
-        <w:ind w:left="240"/>
-      </w:pPr>
-      <w:r>
-        <w:rPr>
-          <w:i/>
-          <w:iCs/>
-          <w:color w:val="6B6B6B"/>
-          <w:sz w:val="19"/>
-          <w:szCs w:val="19"/>
-        </w:rPr>
-        <w:t xml:space="preserve">[Board: DEFICIT + PROTEIN + LIFTING + STEPS]</w:t>
+        <w:t xml:space="preserve">13–22s  </w:t>
+      </w:r>
+      <w:r>
+        <w:rPr>
+          <w:b/>
+          <w:bCs/>
+          <w:sz w:val="22"/>
+          <w:szCs w:val="22"/>
+        </w:rPr>
+        <w:t xml:space="preserve">3 · FIRST PROBLEM</w:t>
+      </w:r>
+    </w:p>
+    <w:p>
+      <w:pPr>
+        <w:spacing w:after="40"/>
+        <w:ind w:left="240"/>
+      </w:pPr>
+      <w:r>
+        <w:rPr>
+          <w:sz w:val="22"/>
+          <w:szCs w:val="22"/>
+        </w:rPr>
+        <w:t xml:space="preserve">Problem: so where does fat come off first? You don't get to choose.</w:t>
       </w:r>
     </w:p>
     <w:p>
@@ -3712,7 +3808,7 @@
         <w:pBdr>
           <w:bottom w:val="single" w:color="FFE11A" w:sz="6" w:space="1"/>
         </w:pBdr>
-        <w:spacing w:after="80" w:before="200"/>
+        <w:spacing w:after="40" w:before="110"/>
       </w:pPr>
       <w:r>
         <w:rPr>
@@ -3722,29 +3818,29 @@
           <w:sz w:val="20"/>
           <w:szCs w:val="20"/>
         </w:rPr>
-        <w:t xml:space="preserve">55–62s  </w:t>
-      </w:r>
-      <w:r>
-        <w:rPr>
-          <w:b/>
-          <w:bCs/>
-          <w:sz w:val="22"/>
-          <w:szCs w:val="22"/>
-        </w:rPr>
-        <w:t xml:space="preserve">SAVE + LINK</w:t>
-      </w:r>
-    </w:p>
-    <w:p>
-      <w:pPr>
-        <w:spacing w:after="80"/>
-        <w:ind w:left="240"/>
-      </w:pPr>
-      <w:r>
-        <w:rPr>
-          <w:sz w:val="24"/>
-          <w:szCs w:val="24"/>
-        </w:rPr>
-        <w:t xml:space="preserve">Save this. Comment FAT and I'll send you my fat-loss basics.</w:t>
+        <w:t xml:space="preserve">22–30s  </w:t>
+      </w:r>
+      <w:r>
+        <w:rPr>
+          <w:b/>
+          <w:bCs/>
+          <w:sz w:val="22"/>
+          <w:szCs w:val="22"/>
+        </w:rPr>
+        <w:t xml:space="preserve">4 · FALSE RELIEF (half the fix)</w:t>
+      </w:r>
+    </w:p>
+    <w:p>
+      <w:pPr>
+        <w:spacing w:after="40"/>
+        <w:ind w:left="240"/>
+      </w:pPr>
+      <w:r>
+        <w:rPr>
+          <w:sz w:val="22"/>
+          <w:szCs w:val="22"/>
+        </w:rPr>
+        <w:t xml:space="preserve">A little good news: one newer, small study did find some extra belly-fat loss with ab exercise.</w:t>
       </w:r>
     </w:p>
     <w:p>
@@ -3752,7 +3848,7 @@
         <w:pBdr>
           <w:bottom w:val="single" w:color="FFE11A" w:sz="6" w:space="1"/>
         </w:pBdr>
-        <w:spacing w:after="80" w:before="200"/>
+        <w:spacing w:after="40" w:before="110"/>
       </w:pPr>
       <w:r>
         <w:rPr>
@@ -3762,16 +3858,125 @@
           <w:sz w:val="20"/>
           <w:szCs w:val="20"/>
         </w:rPr>
-        <w:t xml:space="preserve">62–76s  </w:t>
-      </w:r>
-      <w:r>
-        <w:rPr>
-          <w:b/>
-          <w:bCs/>
-          <w:sz w:val="22"/>
-          <w:szCs w:val="22"/>
-        </w:rPr>
-        <w:t xml:space="preserve">CLOSE + SHARE</w:t>
+        <w:t xml:space="preserve">30–40s  </w:t>
+      </w:r>
+      <w:r>
+        <w:rPr>
+          <w:b/>
+          <w:bCs/>
+          <w:sz w:val="22"/>
+          <w:szCs w:val="22"/>
+        </w:rPr>
+        <w:t xml:space="preserve">5 · SECOND, BIGGER PROBLEM</w:t>
+      </w:r>
+    </w:p>
+    <w:p>
+      <w:pPr>
+        <w:spacing w:after="40"/>
+        <w:ind w:left="240"/>
+      </w:pPr>
+      <w:r>
+        <w:rPr>
+          <w:sz w:val="22"/>
+          <w:szCs w:val="22"/>
+        </w:rPr>
+        <w:t xml:space="preserve">But it was small. And crunches alone won't create the calorie deficit you need.</w:t>
+      </w:r>
+    </w:p>
+    <w:p>
+      <w:pPr>
+        <w:pBdr>
+          <w:bottom w:val="single" w:color="FFE11A" w:sz="6" w:space="1"/>
+        </w:pBdr>
+        <w:spacing w:after="40" w:before="110"/>
+      </w:pPr>
+      <w:r>
+        <w:rPr>
+          <w:b/>
+          <w:bCs/>
+          <w:color w:val="6B6B6B"/>
+          <w:sz w:val="20"/>
+          <w:szCs w:val="20"/>
+        </w:rPr>
+        <w:t xml:space="preserve">40–55s  </w:t>
+      </w:r>
+      <w:r>
+        <w:rPr>
+          <w:b/>
+          <w:bCs/>
+          <w:sz w:val="22"/>
+          <w:szCs w:val="22"/>
+        </w:rPr>
+        <w:t xml:space="preserve">6 · SOLUTION (close every loop)</w:t>
+      </w:r>
+    </w:p>
+    <w:p>
+      <w:pPr>
+        <w:spacing w:after="40"/>
+        <w:ind w:left="240"/>
+      </w:pPr>
+      <w:r>
+        <w:rPr>
+          <w:i/>
+          <w:iCs/>
+          <w:color w:val="6B6B6B"/>
+          <w:sz w:val="18"/>
+          <w:szCs w:val="18"/>
+        </w:rPr>
+        <w:t xml:space="preserve">[Board: DEFICIT + PROTEIN + LIFTING + STEPS]</w:t>
+      </w:r>
+    </w:p>
+    <w:p>
+      <w:pPr>
+        <w:spacing w:after="40"/>
+        <w:ind w:left="240"/>
+      </w:pPr>
+      <w:r>
+        <w:rPr>
+          <w:sz w:val="22"/>
+          <w:szCs w:val="22"/>
+        </w:rPr>
+        <w:t xml:space="preserve">The belly goes when overall body fat goes. A calorie deficit, enough protein, lifting, and daily steps.</w:t>
+      </w:r>
+    </w:p>
+    <w:p>
+      <w:pPr>
+        <w:spacing w:after="40"/>
+        <w:ind w:left="240"/>
+      </w:pPr>
+      <w:r>
+        <w:rPr>
+          <w:sz w:val="22"/>
+          <w:szCs w:val="22"/>
+        </w:rPr>
+        <w:t xml:space="preserve">Comment FAT and I'll send you my fat-loss basics.</w:t>
+      </w:r>
+    </w:p>
+    <w:p>
+      <w:pPr>
+        <w:pBdr>
+          <w:bottom w:val="single" w:color="FFE11A" w:sz="6" w:space="1"/>
+        </w:pBdr>
+        <w:spacing w:after="40" w:before="110"/>
+      </w:pPr>
+      <w:r>
+        <w:rPr>
+          <w:b/>
+          <w:bCs/>
+          <w:color w:val="6B6B6B"/>
+          <w:sz w:val="20"/>
+          <w:szCs w:val="20"/>
+        </w:rPr>
+        <w:t xml:space="preserve">55–72s  </w:t>
+      </w:r>
+      <w:r>
+        <w:rPr>
+          <w:b/>
+          <w:bCs/>
+          <w:sz w:val="22"/>
+          <w:szCs w:val="22"/>
+        </w:rPr>
+        <w:t xml:space="preserve">7 · EMOTIONAL CTA (end on hope)</w:t>
       </w:r>
       <w:r>
         <w:rPr>
@@ -3786,41 +3991,28 @@
     </w:p>
     <w:p>
       <w:pPr>
-        <w:spacing w:after="80"/>
-        <w:ind w:left="240"/>
-      </w:pPr>
-      <w:r>
-        <w:rPr>
-          <w:sz w:val="24"/>
-          <w:szCs w:val="24"/>
-        </w:rPr>
-        <w:t xml:space="preserve">Crunches build your abs. Fat loss shows them.</w:t>
-      </w:r>
-    </w:p>
-    <w:p>
-      <w:pPr>
-        <w:spacing w:after="80"/>
-        <w:ind w:left="240"/>
-      </w:pPr>
-      <w:r>
-        <w:rPr>
-          <w:sz w:val="24"/>
-          <w:szCs w:val="24"/>
-        </w:rPr>
-        <w:t xml:space="preserve">Follow. Gym Basics recap next week.</w:t>
-      </w:r>
-    </w:p>
-    <w:p>
-      <w:pPr>
-        <w:spacing w:after="80"/>
-        <w:ind w:left="240"/>
-      </w:pPr>
-      <w:r>
-        <w:rPr>
-          <w:sz w:val="24"/>
-          <w:szCs w:val="24"/>
-        </w:rPr>
-        <w:t xml:space="preserve">Share this with the friend who just bought a sweat belt.</w:t>
+        <w:spacing w:after="40"/>
+        <w:ind w:left="240"/>
+      </w:pPr>
+      <w:r>
+        <w:rPr>
+          <w:sz w:val="22"/>
+          <w:szCs w:val="22"/>
+        </w:rPr>
+        <w:t xml:space="preserve">Your body isn't ignoring your effort. It's using it everywhere. Keep going.</w:t>
+      </w:r>
+    </w:p>
+    <w:p>
+      <w:pPr>
+        <w:spacing w:after="40"/>
+        <w:ind w:left="240"/>
+      </w:pPr>
+      <w:r>
+        <w:rPr>
+          <w:sz w:val="22"/>
+          <w:szCs w:val="22"/>
+        </w:rPr>
+        <w:t xml:space="preserve">Send this to the friend who just bought a sweat belt.</w:t>
       </w:r>
     </w:p>
     <w:p>
@@ -4034,7 +4226,7 @@
                 <w:sz w:val="20"/>
                 <w:szCs w:val="20"/>
               </w:rPr>
-              <w:t xml:space="preserve">~39 s spoken in English (93 words). Keep the Tamil delivery under 90 s.</w:t>
+              <w:t xml:space="preserve">~50 s spoken in English (122 words). Keep the Tamil delivery under 90 s.</w:t>
             </w:r>
           </w:p>
         </w:tc>
@@ -4100,7 +4292,7 @@
               </w:rPr>
               <w:t xml:space="preserve">  </w:t>
             </w:r>
-            <w:hyperlink w:history="1" r:id="rIdtrm2_ssc2irxd0u5efedp">
+            <w:hyperlink w:history="1" r:id="rIdxum6buqaxye02asfh6jrm">
               <w:r>
                 <w:rPr>
                   <w:rStyle w:val="Hyperlink"/>
@@ -4118,7 +4310,7 @@
               </w:rPr>
               <w:t xml:space="preserve">   Also: </w:t>
             </w:r>
-            <w:hyperlink w:history="1" r:id="rIdlj1bphjjtlshnzlxa8xdn">
+            <w:hyperlink w:history="1" r:id="rId05fkzekyiuttbklqndfp9">
               <w:r>
                 <w:rPr>
                   <w:rStyle w:val="Hyperlink"/>
@@ -4203,7 +4395,7 @@
         <w:pBdr>
           <w:bottom w:val="single" w:color="FFE11A" w:sz="6" w:space="1"/>
         </w:pBdr>
-        <w:spacing w:after="80" w:before="200"/>
+        <w:spacing w:after="40" w:before="110"/>
       </w:pPr>
       <w:r>
         <w:rPr>
@@ -4213,16 +4405,16 @@
           <w:sz w:val="20"/>
           <w:szCs w:val="20"/>
         </w:rPr>
-        <w:t xml:space="preserve">0–5s  </w:t>
-      </w:r>
-      <w:r>
-        <w:rPr>
-          <w:b/>
-          <w:bCs/>
-          <w:sz w:val="22"/>
-          <w:szCs w:val="22"/>
-        </w:rPr>
-        <w:t xml:space="preserve">HOOK STACK</w:t>
+        <w:t xml:space="preserve">0–3s  </w:t>
+      </w:r>
+      <w:r>
+        <w:rPr>
+          <w:b/>
+          <w:bCs/>
+          <w:sz w:val="22"/>
+          <w:szCs w:val="22"/>
+        </w:rPr>
+        <w:t xml:space="preserve">1 · HOOK: CURIOSITY</w:t>
       </w:r>
       <w:r>
         <w:rPr>
@@ -4237,7 +4429,7 @@
     </w:p>
     <w:p>
       <w:pPr>
-        <w:spacing w:after="80"/>
+        <w:spacing w:after="40"/>
         <w:ind w:left="240"/>
       </w:pPr>
       <w:r>
@@ -4245,49 +4437,23 @@
           <w:i/>
           <w:iCs/>
           <w:color w:val="6B6B6B"/>
-          <w:sz w:val="19"/>
-          <w:szCs w:val="19"/>
-        </w:rPr>
-        <w:t xml:space="preserve">[Rising SFX.]</w:t>
-      </w:r>
-    </w:p>
-    <w:p>
-      <w:pPr>
-        <w:spacing w:after="80"/>
-        <w:ind w:left="240"/>
-      </w:pPr>
-      <w:r>
-        <w:rPr>
-          <w:sz w:val="24"/>
-          <w:szCs w:val="24"/>
+          <w:sz w:val="18"/>
+          <w:szCs w:val="18"/>
+        </w:rPr>
+        <w:t xml:space="preserve">[Rising SFX starts under the first word.]</w:t>
+      </w:r>
+    </w:p>
+    <w:p>
+      <w:pPr>
+        <w:spacing w:after="40"/>
+        <w:ind w:left="240"/>
+      </w:pPr>
+      <w:r>
+        <w:rPr>
+          <w:sz w:val="22"/>
+          <w:szCs w:val="22"/>
         </w:rPr>
         <w:t xml:space="preserve">Five seconds down. Five seconds up.</w:t>
-      </w:r>
-    </w:p>
-    <w:p>
-      <w:pPr>
-        <w:spacing w:after="80"/>
-        <w:ind w:left="240"/>
-      </w:pPr>
-      <w:r>
-        <w:rPr>
-          <w:sz w:val="24"/>
-          <w:szCs w:val="24"/>
-        </w:rPr>
-        <w:t xml:space="preserve">Time under tension equals more muscle?</w:t>
-      </w:r>
-    </w:p>
-    <w:p>
-      <w:pPr>
-        <w:spacing w:after="80"/>
-        <w:ind w:left="240"/>
-      </w:pPr>
-      <w:r>
-        <w:rPr>
-          <w:sz w:val="24"/>
-          <w:szCs w:val="24"/>
-        </w:rPr>
-        <w:t xml:space="preserve">Turns out… not really.</w:t>
       </w:r>
     </w:p>
     <w:p>
@@ -4295,7 +4461,7 @@
         <w:pBdr>
           <w:bottom w:val="single" w:color="FFE11A" w:sz="6" w:space="1"/>
         </w:pBdr>
-        <w:spacing w:after="80" w:before="200"/>
+        <w:spacing w:after="40" w:before="110"/>
       </w:pPr>
       <w:r>
         <w:rPr>
@@ -4305,16 +4471,16 @@
           <w:sz w:val="20"/>
           <w:szCs w:val="20"/>
         </w:rPr>
-        <w:t xml:space="preserve">5–7s  </w:t>
-      </w:r>
-      <w:r>
-        <w:rPr>
-          <w:b/>
-          <w:bCs/>
-          <w:sz w:val="22"/>
-          <w:szCs w:val="22"/>
-        </w:rPr>
-        <w:t xml:space="preserve">MEME</w:t>
+        <w:t xml:space="preserve">3–6s  </w:t>
+      </w:r>
+      <w:r>
+        <w:rPr>
+          <w:b/>
+          <w:bCs/>
+          <w:sz w:val="22"/>
+          <w:szCs w:val="22"/>
+        </w:rPr>
+        <w:t xml:space="preserve">1 · HOOK: PATTERN INTERRUPT</w:t>
       </w:r>
       <w:r>
         <w:rPr>
@@ -4329,7 +4495,20 @@
     </w:p>
     <w:p>
       <w:pPr>
-        <w:spacing w:after="80"/>
+        <w:spacing w:after="40"/>
+        <w:ind w:left="240"/>
+      </w:pPr>
+      <w:r>
+        <w:rPr>
+          <w:sz w:val="22"/>
+          <w:szCs w:val="22"/>
+        </w:rPr>
+        <w:t xml:space="preserve">Slow reps don't build more muscle.</w:t>
+      </w:r>
+    </w:p>
+    <w:p>
+      <w:pPr>
+        <w:spacing w:after="40"/>
         <w:ind w:left="240"/>
       </w:pPr>
       <w:r>
@@ -4337,10 +4516,10 @@
           <w:i/>
           <w:iCs/>
           <w:color w:val="6B6B6B"/>
-          <w:sz w:val="19"/>
-          <w:szCs w:val="19"/>
-        </w:rPr>
-        <w:t xml:space="preserve">[MEME: slow-motion hero walk parody.]</w:t>
+          <w:sz w:val="18"/>
+          <w:szCs w:val="18"/>
+        </w:rPr>
+        <w:t xml:space="preserve">[MEME lands on the turn: a slow-motion hero walk]</w:t>
       </w:r>
     </w:p>
     <w:p>
@@ -4348,7 +4527,7 @@
         <w:pBdr>
           <w:bottom w:val="single" w:color="FFE11A" w:sz="6" w:space="1"/>
         </w:pBdr>
-        <w:spacing w:after="80" w:before="200"/>
+        <w:spacing w:after="40" w:before="110"/>
       </w:pPr>
       <w:r>
         <w:rPr>
@@ -4358,16 +4537,16 @@
           <w:sz w:val="20"/>
           <w:szCs w:val="20"/>
         </w:rPr>
-        <w:t xml:space="preserve">7–12s  </w:t>
-      </w:r>
-      <w:r>
-        <w:rPr>
-          <w:b/>
-          <w:bCs/>
-          <w:sz w:val="22"/>
-          <w:szCs w:val="22"/>
-        </w:rPr>
-        <w:t xml:space="preserve">AUTHORITY</w:t>
+        <w:t xml:space="preserve">6–13s  </w:t>
+      </w:r>
+      <w:r>
+        <w:rPr>
+          <w:b/>
+          <w:bCs/>
+          <w:sz w:val="22"/>
+          <w:szCs w:val="22"/>
+        </w:rPr>
+        <w:t xml:space="preserve">2 · VALUE (real info by 13 s)</w:t>
       </w:r>
       <w:r>
         <w:rPr>
@@ -4382,15 +4561,31 @@
     </w:p>
     <w:p>
       <w:pPr>
-        <w:spacing w:after="80"/>
-        <w:ind w:left="240"/>
-      </w:pPr>
-      <w:r>
-        <w:rPr>
-          <w:sz w:val="24"/>
-          <w:szCs w:val="24"/>
-        </w:rPr>
-        <w:t xml:space="preserve">Lifting Science, episode 4. The last one of this round.</w:t>
+        <w:spacing w:after="40"/>
+        <w:ind w:left="240"/>
+      </w:pPr>
+      <w:r>
+        <w:rPr>
+          <w:sz w:val="22"/>
+          <w:szCs w:val="22"/>
+        </w:rPr>
+        <w:t xml:space="preserve">Lifting Science, episode 4. A 2026 meta-analysis: rep tempo had minimal overall effect on muscle growth.</w:t>
+      </w:r>
+    </w:p>
+    <w:p>
+      <w:pPr>
+        <w:spacing w:after="40"/>
+        <w:ind w:left="240"/>
+      </w:pPr>
+      <w:r>
+        <w:rPr>
+          <w:i/>
+          <w:iCs/>
+          <w:color w:val="6B6B6B"/>
+          <w:sz w:val="18"/>
+          <w:szCs w:val="18"/>
+        </w:rPr>
+        <w:t xml:space="preserve">[ON-SCREEN: 2026 meta-analysis on repetition tempo]</w:t>
       </w:r>
     </w:p>
     <w:p>
@@ -4398,7 +4593,7 @@
         <w:pBdr>
           <w:bottom w:val="single" w:color="FFE11A" w:sz="6" w:space="1"/>
         </w:pBdr>
-        <w:spacing w:after="80" w:before="200"/>
+        <w:spacing w:after="40" w:before="110"/>
       </w:pPr>
       <w:r>
         <w:rPr>
@@ -4408,84 +4603,29 @@
           <w:sz w:val="20"/>
           <w:szCs w:val="20"/>
         </w:rPr>
-        <w:t xml:space="preserve">12–50s  </w:t>
-      </w:r>
-      <w:r>
-        <w:rPr>
-          <w:b/>
-          <w:bCs/>
-          <w:sz w:val="22"/>
-          <w:szCs w:val="22"/>
-        </w:rPr>
-        <w:t xml:space="preserve">THE BOARD</w:t>
-      </w:r>
-    </w:p>
-    <w:p>
-      <w:pPr>
-        <w:spacing w:after="80"/>
-        <w:ind w:left="240"/>
-      </w:pPr>
-      <w:r>
-        <w:rPr>
-          <w:sz w:val="24"/>
-          <w:szCs w:val="24"/>
-        </w:rPr>
-        <w:t xml:space="preserve">A 2026 meta-analysis found rep tempo has minimal overall effect on muscle growth.</w:t>
-      </w:r>
-    </w:p>
-    <w:p>
-      <w:pPr>
-        <w:spacing w:after="80"/>
-        <w:ind w:left="240"/>
-      </w:pPr>
-      <w:r>
-        <w:rPr>
-          <w:i/>
-          <w:iCs/>
-          <w:color w:val="6B6B6B"/>
-          <w:sz w:val="19"/>
-          <w:szCs w:val="19"/>
-        </w:rPr>
-        <w:t xml:space="preserve">[ON-SCREEN: 2026 meta-analysis on repetition tempo ('How slow should you go?')]</w:t>
-      </w:r>
-    </w:p>
-    <w:p>
-      <w:pPr>
-        <w:spacing w:after="80"/>
-        <w:ind w:left="240"/>
-      </w:pPr>
-      <w:r>
-        <w:rPr>
-          <w:sz w:val="24"/>
-          <w:szCs w:val="24"/>
-        </w:rPr>
-        <w:t xml:space="preserve">So control doesn't matter? No. Control matters. Slow doesn't.</w:t>
-      </w:r>
-    </w:p>
-    <w:p>
-      <w:pPr>
-        <w:spacing w:after="80"/>
-        <w:ind w:left="240"/>
-      </w:pPr>
-      <w:r>
-        <w:rPr>
-          <w:sz w:val="24"/>
-          <w:szCs w:val="24"/>
-        </w:rPr>
-        <w:t xml:space="preserve">Lower the weight under control. Lift with intent. No bouncing.</w:t>
-      </w:r>
-    </w:p>
-    <w:p>
-      <w:pPr>
-        <w:spacing w:after="80"/>
-        <w:ind w:left="240"/>
-      </w:pPr>
-      <w:r>
-        <w:rPr>
-          <w:sz w:val="24"/>
-          <w:szCs w:val="24"/>
-        </w:rPr>
-        <w:t xml:space="preserve">Super-slow reps usually just mean lighter weights.</w:t>
+        <w:t xml:space="preserve">13–22s  </w:t>
+      </w:r>
+      <w:r>
+        <w:rPr>
+          <w:b/>
+          <w:bCs/>
+          <w:sz w:val="22"/>
+          <w:szCs w:val="22"/>
+        </w:rPr>
+        <w:t xml:space="preserve">3 · FIRST PROBLEM</w:t>
+      </w:r>
+    </w:p>
+    <w:p>
+      <w:pPr>
+        <w:spacing w:after="40"/>
+        <w:ind w:left="240"/>
+      </w:pPr>
+      <w:r>
+        <w:rPr>
+          <w:sz w:val="22"/>
+          <w:szCs w:val="22"/>
+        </w:rPr>
+        <w:t xml:space="preserve">Problem: then why does slow feel so much harder?</w:t>
       </w:r>
     </w:p>
     <w:p>
@@ -4493,7 +4633,7 @@
         <w:pBdr>
           <w:bottom w:val="single" w:color="FFE11A" w:sz="6" w:space="1"/>
         </w:pBdr>
-        <w:spacing w:after="80" w:before="200"/>
+        <w:spacing w:after="40" w:before="110"/>
       </w:pPr>
       <w:r>
         <w:rPr>
@@ -4503,29 +4643,29 @@
           <w:sz w:val="20"/>
           <w:szCs w:val="20"/>
         </w:rPr>
-        <w:t xml:space="preserve">50–57s  </w:t>
-      </w:r>
-      <w:r>
-        <w:rPr>
-          <w:b/>
-          <w:bCs/>
-          <w:sz w:val="22"/>
-          <w:szCs w:val="22"/>
-        </w:rPr>
-        <w:t xml:space="preserve">LINK</w:t>
-      </w:r>
-    </w:p>
-    <w:p>
-      <w:pPr>
-        <w:spacing w:after="80"/>
-        <w:ind w:left="240"/>
-      </w:pPr>
-      <w:r>
-        <w:rPr>
-          <w:sz w:val="24"/>
-          <w:szCs w:val="24"/>
-        </w:rPr>
-        <w:t xml:space="preserve">Comment SERIES and I'll send you the recap of all four episodes.</w:t>
+        <w:t xml:space="preserve">22–30s  </w:t>
+      </w:r>
+      <w:r>
+        <w:rPr>
+          <w:b/>
+          <w:bCs/>
+          <w:sz w:val="22"/>
+          <w:szCs w:val="22"/>
+        </w:rPr>
+        <w:t xml:space="preserve">4 · FALSE RELIEF (half the fix)</w:t>
+      </w:r>
+    </w:p>
+    <w:p>
+      <w:pPr>
+        <w:spacing w:after="40"/>
+        <w:ind w:left="240"/>
+      </w:pPr>
+      <w:r>
+        <w:rPr>
+          <w:sz w:val="22"/>
+          <w:szCs w:val="22"/>
+        </w:rPr>
+        <w:t xml:space="preserve">Because it is harder. But harder isn't the same as more growth.</w:t>
       </w:r>
     </w:p>
     <w:p>
@@ -4533,7 +4673,7 @@
         <w:pBdr>
           <w:bottom w:val="single" w:color="FFE11A" w:sz="6" w:space="1"/>
         </w:pBdr>
-        <w:spacing w:after="80" w:before="200"/>
+        <w:spacing w:after="40" w:before="110"/>
       </w:pPr>
       <w:r>
         <w:rPr>
@@ -4543,16 +4683,109 @@
           <w:sz w:val="20"/>
           <w:szCs w:val="20"/>
         </w:rPr>
-        <w:t xml:space="preserve">57–72s  </w:t>
-      </w:r>
-      <w:r>
-        <w:rPr>
-          <w:b/>
-          <w:bCs/>
-          <w:sz w:val="22"/>
-          <w:szCs w:val="22"/>
-        </w:rPr>
-        <w:t xml:space="preserve">CLOSE + SHARE</w:t>
+        <w:t xml:space="preserve">30–40s  </w:t>
+      </w:r>
+      <w:r>
+        <w:rPr>
+          <w:b/>
+          <w:bCs/>
+          <w:sz w:val="22"/>
+          <w:szCs w:val="22"/>
+        </w:rPr>
+        <w:t xml:space="preserve">5 · SECOND, BIGGER PROBLEM</w:t>
+      </w:r>
+    </w:p>
+    <w:p>
+      <w:pPr>
+        <w:spacing w:after="40"/>
+        <w:ind w:left="240"/>
+      </w:pPr>
+      <w:r>
+        <w:rPr>
+          <w:sz w:val="22"/>
+          <w:szCs w:val="22"/>
+        </w:rPr>
+        <w:t xml:space="preserve">The bigger problem: super-slow reps usually mean lighter weights.</w:t>
+      </w:r>
+    </w:p>
+    <w:p>
+      <w:pPr>
+        <w:pBdr>
+          <w:bottom w:val="single" w:color="FFE11A" w:sz="6" w:space="1"/>
+        </w:pBdr>
+        <w:spacing w:after="40" w:before="110"/>
+      </w:pPr>
+      <w:r>
+        <w:rPr>
+          <w:b/>
+          <w:bCs/>
+          <w:color w:val="6B6B6B"/>
+          <w:sz w:val="20"/>
+          <w:szCs w:val="20"/>
+        </w:rPr>
+        <w:t xml:space="preserve">40–55s  </w:t>
+      </w:r>
+      <w:r>
+        <w:rPr>
+          <w:b/>
+          <w:bCs/>
+          <w:sz w:val="22"/>
+          <w:szCs w:val="22"/>
+        </w:rPr>
+        <w:t xml:space="preserve">6 · SOLUTION (close every loop)</w:t>
+      </w:r>
+    </w:p>
+    <w:p>
+      <w:pPr>
+        <w:spacing w:after="40"/>
+        <w:ind w:left="240"/>
+      </w:pPr>
+      <w:r>
+        <w:rPr>
+          <w:sz w:val="22"/>
+          <w:szCs w:val="22"/>
+        </w:rPr>
+        <w:t xml:space="preserve">So lower the weight under control, lift with intent, no bouncing. Spend your effort getting close to failure, not counting seconds.</w:t>
+      </w:r>
+    </w:p>
+    <w:p>
+      <w:pPr>
+        <w:spacing w:after="40"/>
+        <w:ind w:left="240"/>
+      </w:pPr>
+      <w:r>
+        <w:rPr>
+          <w:sz w:val="22"/>
+          <w:szCs w:val="22"/>
+        </w:rPr>
+        <w:t xml:space="preserve">Comment SERIES and I'll send you the recap of all four episodes.</w:t>
+      </w:r>
+    </w:p>
+    <w:p>
+      <w:pPr>
+        <w:pBdr>
+          <w:bottom w:val="single" w:color="FFE11A" w:sz="6" w:space="1"/>
+        </w:pBdr>
+        <w:spacing w:after="40" w:before="110"/>
+      </w:pPr>
+      <w:r>
+        <w:rPr>
+          <w:b/>
+          <w:bCs/>
+          <w:color w:val="6B6B6B"/>
+          <w:sz w:val="20"/>
+          <w:szCs w:val="20"/>
+        </w:rPr>
+        <w:t xml:space="preserve">55–72s  </w:t>
+      </w:r>
+      <w:r>
+        <w:rPr>
+          <w:b/>
+          <w:bCs/>
+          <w:sz w:val="22"/>
+          <w:szCs w:val="22"/>
+        </w:rPr>
+        <w:t xml:space="preserve">7 · EMOTIONAL CTA (end on hope)</w:t>
       </w:r>
       <w:r>
         <w:rPr>
@@ -4567,28 +4800,28 @@
     </w:p>
     <w:p>
       <w:pPr>
-        <w:spacing w:after="80"/>
-        <w:ind w:left="240"/>
-      </w:pPr>
-      <w:r>
-        <w:rPr>
-          <w:sz w:val="24"/>
-          <w:szCs w:val="24"/>
-        </w:rPr>
-        <w:t xml:space="preserve">Follow for season 2.</w:t>
-      </w:r>
-    </w:p>
-    <w:p>
-      <w:pPr>
-        <w:spacing w:after="80"/>
-        <w:ind w:left="240"/>
-      </w:pPr>
-      <w:r>
-        <w:rPr>
-          <w:sz w:val="24"/>
-          <w:szCs w:val="24"/>
-        </w:rPr>
-        <w:t xml:space="preserve">Share this with the friend counting 'one thousand one' on every curl.</w:t>
+        <w:spacing w:after="40"/>
+        <w:ind w:left="240"/>
+      </w:pPr>
+      <w:r>
+        <w:rPr>
+          <w:sz w:val="22"/>
+          <w:szCs w:val="22"/>
+        </w:rPr>
+        <w:t xml:space="preserve">That's season 1 of Lifting Science. You now train smarter than most of the gym. Follow for season 2.</w:t>
+      </w:r>
+    </w:p>
+    <w:p>
+      <w:pPr>
+        <w:spacing w:after="40"/>
+        <w:ind w:left="240"/>
+      </w:pPr>
+      <w:r>
+        <w:rPr>
+          <w:sz w:val="22"/>
+          <w:szCs w:val="22"/>
+        </w:rPr>
+        <w:t xml:space="preserve">Send this to the friend counting 'one thousand one' on every curl.</w:t>
       </w:r>
     </w:p>
     <w:p>
@@ -4802,7 +5035,7 @@
                 <w:sz w:val="20"/>
                 <w:szCs w:val="20"/>
               </w:rPr>
-              <w:t xml:space="preserve">~45 s spoken in English (108 words). Keep the Tamil delivery under 90 s.</w:t>
+              <w:t xml:space="preserve">~47 s spoken in English (115 words). Keep the Tamil delivery under 90 s.</w:t>
             </w:r>
           </w:p>
         </w:tc>
@@ -4868,7 +5101,7 @@
               </w:rPr>
               <w:t xml:space="preserve">  </w:t>
             </w:r>
-            <w:hyperlink w:history="1" r:id="rIdwipxckdxs4nbd0ayjqnmm">
+            <w:hyperlink w:history="1" r:id="rIdyhuwpycxae8cicaczwnpq">
               <w:r>
                 <w:rPr>
                   <w:rStyle w:val="Hyperlink"/>
@@ -4887,7 +5120,7 @@
         <w:pBdr>
           <w:bottom w:val="single" w:color="FFE11A" w:sz="6" w:space="1"/>
         </w:pBdr>
-        <w:spacing w:after="80" w:before="200"/>
+        <w:spacing w:after="40" w:before="110"/>
       </w:pPr>
       <w:r>
         <w:rPr>
@@ -4897,16 +5130,16 @@
           <w:sz w:val="20"/>
           <w:szCs w:val="20"/>
         </w:rPr>
-        <w:t xml:space="preserve">0–5s  </w:t>
-      </w:r>
-      <w:r>
-        <w:rPr>
-          <w:b/>
-          <w:bCs/>
-          <w:sz w:val="22"/>
-          <w:szCs w:val="22"/>
-        </w:rPr>
-        <w:t xml:space="preserve">HOOK STACK</w:t>
+        <w:t xml:space="preserve">0–3s  </w:t>
+      </w:r>
+      <w:r>
+        <w:rPr>
+          <w:b/>
+          <w:bCs/>
+          <w:sz w:val="22"/>
+          <w:szCs w:val="22"/>
+        </w:rPr>
+        <w:t xml:space="preserve">1 · HOOK: CURIOSITY</w:t>
       </w:r>
       <w:r>
         <w:rPr>
@@ -4921,7 +5154,7 @@
     </w:p>
     <w:p>
       <w:pPr>
-        <w:spacing w:after="80"/>
+        <w:spacing w:after="40"/>
         <w:ind w:left="240"/>
       </w:pPr>
       <w:r>
@@ -4929,49 +5162,39 @@
           <w:i/>
           <w:iCs/>
           <w:color w:val="6B6B6B"/>
-          <w:sz w:val="19"/>
-          <w:szCs w:val="19"/>
-        </w:rPr>
-        <w:t xml:space="preserve">[Rising SFX. Rain B-roll if you have it.]</w:t>
-      </w:r>
-    </w:p>
-    <w:p>
-      <w:pPr>
-        <w:spacing w:after="80"/>
-        <w:ind w:left="240"/>
-      </w:pPr>
-      <w:r>
-        <w:rPr>
-          <w:sz w:val="24"/>
-          <w:szCs w:val="24"/>
+          <w:sz w:val="18"/>
+          <w:szCs w:val="18"/>
+        </w:rPr>
+        <w:t xml:space="preserve">[Rising SFX starts under the first word.]</w:t>
+      </w:r>
+    </w:p>
+    <w:p>
+      <w:pPr>
+        <w:spacing w:after="40"/>
+        <w:ind w:left="240"/>
+      </w:pPr>
+      <w:r>
+        <w:rPr>
+          <w:sz w:val="22"/>
+          <w:szCs w:val="22"/>
         </w:rPr>
         <w:t xml:space="preserve">Mazhai… so no gym today?</w:t>
       </w:r>
     </w:p>
     <w:p>
       <w:pPr>
-        <w:spacing w:after="80"/>
-        <w:ind w:left="240"/>
-      </w:pPr>
-      <w:r>
-        <w:rPr>
-          <w:sz w:val="24"/>
-          <w:szCs w:val="24"/>
-        </w:rPr>
-        <w:t xml:space="preserve">Your excuse is like the rain. It never stops.</w:t>
-      </w:r>
-    </w:p>
-    <w:p>
-      <w:pPr>
-        <w:spacing w:after="80"/>
-        <w:ind w:left="240"/>
-      </w:pPr>
-      <w:r>
-        <w:rPr>
-          <w:sz w:val="24"/>
-          <w:szCs w:val="24"/>
-        </w:rPr>
-        <w:t xml:space="preserve">Here's a 15-minute fix.</w:t>
+        <w:spacing w:after="40"/>
+        <w:ind w:left="240"/>
+      </w:pPr>
+      <w:r>
+        <w:rPr>
+          <w:i/>
+          <w:iCs/>
+          <w:color w:val="6B6B6B"/>
+          <w:sz w:val="18"/>
+          <w:szCs w:val="18"/>
+        </w:rPr>
+        <w:t xml:space="preserve">[Rain B-roll if you have it.]</w:t>
       </w:r>
     </w:p>
     <w:p>
@@ -4979,7 +5202,7 @@
         <w:pBdr>
           <w:bottom w:val="single" w:color="FFE11A" w:sz="6" w:space="1"/>
         </w:pBdr>
-        <w:spacing w:after="80" w:before="200"/>
+        <w:spacing w:after="40" w:before="110"/>
       </w:pPr>
       <w:r>
         <w:rPr>
@@ -4989,16 +5212,16 @@
           <w:sz w:val="20"/>
           <w:szCs w:val="20"/>
         </w:rPr>
-        <w:t xml:space="preserve">5–7s  </w:t>
-      </w:r>
-      <w:r>
-        <w:rPr>
-          <w:b/>
-          <w:bCs/>
-          <w:sz w:val="22"/>
-          <w:szCs w:val="22"/>
-        </w:rPr>
-        <w:t xml:space="preserve">MEME</w:t>
+        <w:t xml:space="preserve">3–6s  </w:t>
+      </w:r>
+      <w:r>
+        <w:rPr>
+          <w:b/>
+          <w:bCs/>
+          <w:sz w:val="22"/>
+          <w:szCs w:val="22"/>
+        </w:rPr>
+        <w:t xml:space="preserve">1 · HOOK: PATTERN INTERRUPT</w:t>
       </w:r>
       <w:r>
         <w:rPr>
@@ -5013,7 +5236,20 @@
     </w:p>
     <w:p>
       <w:pPr>
-        <w:spacing w:after="80"/>
+        <w:spacing w:after="40"/>
+        <w:ind w:left="240"/>
+      </w:pPr>
+      <w:r>
+        <w:rPr>
+          <w:sz w:val="22"/>
+          <w:szCs w:val="22"/>
+        </w:rPr>
+        <w:t xml:space="preserve">You don't need a gym to build muscle today.</w:t>
+      </w:r>
+    </w:p>
+    <w:p>
+      <w:pPr>
+        <w:spacing w:after="40"/>
         <w:ind w:left="240"/>
       </w:pPr>
       <w:r>
@@ -5021,10 +5257,10 @@
           <w:i/>
           <w:iCs/>
           <w:color w:val="6B6B6B"/>
-          <w:sz w:val="19"/>
-          <w:szCs w:val="19"/>
-        </w:rPr>
-        <w:t xml:space="preserve">[MEME: lazy hero wrapped in a blanket during rain, comedy.]</w:t>
+          <w:sz w:val="18"/>
+          <w:szCs w:val="18"/>
+        </w:rPr>
+        <w:t xml:space="preserve">[MEME lands on the turn: a lazy hero wrapped in a blanket during rain]</w:t>
       </w:r>
     </w:p>
     <w:p>
@@ -5032,7 +5268,7 @@
         <w:pBdr>
           <w:bottom w:val="single" w:color="FFE11A" w:sz="6" w:space="1"/>
         </w:pBdr>
-        <w:spacing w:after="80" w:before="200"/>
+        <w:spacing w:after="40" w:before="110"/>
       </w:pPr>
       <w:r>
         <w:rPr>
@@ -5042,16 +5278,16 @@
           <w:sz w:val="20"/>
           <w:szCs w:val="20"/>
         </w:rPr>
-        <w:t xml:space="preserve">7–12s  </w:t>
-      </w:r>
-      <w:r>
-        <w:rPr>
-          <w:b/>
-          <w:bCs/>
-          <w:sz w:val="22"/>
-          <w:szCs w:val="22"/>
-        </w:rPr>
-        <w:t xml:space="preserve">AUTHORITY</w:t>
+        <w:t xml:space="preserve">6–13s  </w:t>
+      </w:r>
+      <w:r>
+        <w:rPr>
+          <w:b/>
+          <w:bCs/>
+          <w:sz w:val="22"/>
+          <w:szCs w:val="22"/>
+        </w:rPr>
+        <w:t xml:space="preserve">2 · VALUE (real info by 13 s)</w:t>
       </w:r>
       <w:r>
         <w:rPr>
@@ -5066,15 +5302,31 @@
     </w:p>
     <w:p>
       <w:pPr>
-        <w:spacing w:after="80"/>
-        <w:ind w:left="240"/>
-      </w:pPr>
-      <w:r>
-        <w:rPr>
-          <w:sz w:val="24"/>
-          <w:szCs w:val="24"/>
-        </w:rPr>
-        <w:t xml:space="preserve">Eight years of training taught me one thing: consistency beats perfect conditions.</w:t>
+        <w:spacing w:after="40"/>
+        <w:ind w:left="240"/>
+      </w:pPr>
+      <w:r>
+        <w:rPr>
+          <w:sz w:val="22"/>
+          <w:szCs w:val="22"/>
+        </w:rPr>
+        <w:t xml:space="preserve">Research shows light loads built similar muscle to heavy ones when sets went close to failure.</w:t>
+      </w:r>
+    </w:p>
+    <w:p>
+      <w:pPr>
+        <w:spacing w:after="40"/>
+        <w:ind w:left="240"/>
+      </w:pPr>
+      <w:r>
+        <w:rPr>
+          <w:i/>
+          <w:iCs/>
+          <w:color w:val="6B6B6B"/>
+          <w:sz w:val="18"/>
+          <w:szCs w:val="18"/>
+        </w:rPr>
+        <w:t xml:space="preserve">[ON-SCREEN: Schoenfeld et al., J Strength Cond Res 2017]</w:t>
       </w:r>
     </w:p>
     <w:p>
@@ -5082,7 +5334,7 @@
         <w:pBdr>
           <w:bottom w:val="single" w:color="FFE11A" w:sz="6" w:space="1"/>
         </w:pBdr>
-        <w:spacing w:after="80" w:before="200"/>
+        <w:spacing w:after="40" w:before="110"/>
       </w:pPr>
       <w:r>
         <w:rPr>
@@ -5092,87 +5344,29 @@
           <w:sz w:val="20"/>
           <w:szCs w:val="20"/>
         </w:rPr>
-        <w:t xml:space="preserve">12–48s  </w:t>
-      </w:r>
-      <w:r>
-        <w:rPr>
-          <w:b/>
-          <w:bCs/>
-          <w:sz w:val="22"/>
-          <w:szCs w:val="22"/>
-        </w:rPr>
-        <w:t xml:space="preserve">THE PLAN</w:t>
-      </w:r>
-    </w:p>
-    <w:p>
-      <w:pPr>
-        <w:spacing w:after="80"/>
-        <w:ind w:left="240"/>
-      </w:pPr>
-      <w:r>
-        <w:rPr>
-          <w:sz w:val="24"/>
-          <w:szCs w:val="24"/>
-        </w:rPr>
-        <w:t xml:space="preserve">Research shows light loads can build similar muscle to heavy loads, when you go close to failure.</w:t>
-      </w:r>
-    </w:p>
-    <w:p>
-      <w:pPr>
-        <w:spacing w:after="80"/>
-        <w:ind w:left="240"/>
-      </w:pPr>
-      <w:r>
-        <w:rPr>
-          <w:i/>
-          <w:iCs/>
-          <w:color w:val="6B6B6B"/>
-          <w:sz w:val="19"/>
-          <w:szCs w:val="19"/>
-        </w:rPr>
-        <w:t xml:space="preserve">[ON-SCREEN: Schoenfeld et al., J Strength Cond Res 2017]</w:t>
-      </w:r>
-    </w:p>
-    <w:p>
-      <w:pPr>
-        <w:spacing w:after="80"/>
-        <w:ind w:left="240"/>
-      </w:pPr>
-      <w:r>
-        <w:rPr>
-          <w:sz w:val="24"/>
-          <w:szCs w:val="24"/>
-        </w:rPr>
-        <w:t xml:space="preserve">So home workouts equal the gym? Not exactly. Progressing is harder without weights. But it beats zero.</w:t>
-      </w:r>
-    </w:p>
-    <w:p>
-      <w:pPr>
-        <w:spacing w:after="80"/>
-        <w:ind w:left="240"/>
-      </w:pPr>
-      <w:r>
-        <w:rPr>
-          <w:sz w:val="24"/>
-          <w:szCs w:val="24"/>
-        </w:rPr>
-        <w:t xml:space="preserve">The 15-minute circuit: squats, push-ups, backpack rows, lunges, plank. Three rounds, close to failure.</w:t>
-      </w:r>
-    </w:p>
-    <w:p>
-      <w:pPr>
-        <w:spacing w:after="80"/>
-        <w:ind w:left="240"/>
-      </w:pPr>
-      <w:r>
-        <w:rPr>
-          <w:i/>
-          <w:iCs/>
-          <w:color w:val="6B6B6B"/>
-          <w:sz w:val="19"/>
-          <w:szCs w:val="19"/>
-        </w:rPr>
-        <w:t xml:space="preserve">[Show each exercise for 1–2 s with a counter on screen.]</w:t>
+        <w:t xml:space="preserve">13–22s  </w:t>
+      </w:r>
+      <w:r>
+        <w:rPr>
+          <w:b/>
+          <w:bCs/>
+          <w:sz w:val="22"/>
+          <w:szCs w:val="22"/>
+        </w:rPr>
+        <w:t xml:space="preserve">3 · FIRST PROBLEM</w:t>
+      </w:r>
+    </w:p>
+    <w:p>
+      <w:pPr>
+        <w:spacing w:after="40"/>
+        <w:ind w:left="240"/>
+      </w:pPr>
+      <w:r>
+        <w:rPr>
+          <w:sz w:val="22"/>
+          <w:szCs w:val="22"/>
+        </w:rPr>
+        <w:t xml:space="preserve">Problem: at home, you don't have weights to progress with.</w:t>
       </w:r>
     </w:p>
     <w:p>
@@ -5180,7 +5374,7 @@
         <w:pBdr>
           <w:bottom w:val="single" w:color="FFE11A" w:sz="6" w:space="1"/>
         </w:pBdr>
-        <w:spacing w:after="80" w:before="200"/>
+        <w:spacing w:after="40" w:before="110"/>
       </w:pPr>
       <w:r>
         <w:rPr>
@@ -5190,16 +5384,152 @@
           <w:sz w:val="20"/>
           <w:szCs w:val="20"/>
         </w:rPr>
-        <w:t xml:space="preserve">48–64s  </w:t>
-      </w:r>
-      <w:r>
-        <w:rPr>
-          <w:b/>
-          <w:bCs/>
-          <w:sz w:val="22"/>
-          <w:szCs w:val="22"/>
-        </w:rPr>
-        <w:t xml:space="preserve">CLOSE + SHARE</w:t>
+        <w:t xml:space="preserve">22–30s  </w:t>
+      </w:r>
+      <w:r>
+        <w:rPr>
+          <w:b/>
+          <w:bCs/>
+          <w:sz w:val="22"/>
+          <w:szCs w:val="22"/>
+        </w:rPr>
+        <w:t xml:space="preserve">4 · FALSE RELIEF (half the fix)</w:t>
+      </w:r>
+    </w:p>
+    <w:p>
+      <w:pPr>
+        <w:spacing w:after="40"/>
+        <w:ind w:left="240"/>
+      </w:pPr>
+      <w:r>
+        <w:rPr>
+          <w:sz w:val="22"/>
+          <w:szCs w:val="22"/>
+        </w:rPr>
+        <w:t xml:space="preserve">So use reps instead. More reps, slower lowering, shorter rests.</w:t>
+      </w:r>
+    </w:p>
+    <w:p>
+      <w:pPr>
+        <w:pBdr>
+          <w:bottom w:val="single" w:color="FFE11A" w:sz="6" w:space="1"/>
+        </w:pBdr>
+        <w:spacing w:after="40" w:before="110"/>
+      </w:pPr>
+      <w:r>
+        <w:rPr>
+          <w:b/>
+          <w:bCs/>
+          <w:color w:val="6B6B6B"/>
+          <w:sz w:val="20"/>
+          <w:szCs w:val="20"/>
+        </w:rPr>
+        <w:t xml:space="preserve">30–40s  </w:t>
+      </w:r>
+      <w:r>
+        <w:rPr>
+          <w:b/>
+          <w:bCs/>
+          <w:sz w:val="22"/>
+          <w:szCs w:val="22"/>
+        </w:rPr>
+        <w:t xml:space="preserve">5 · SECOND, BIGGER PROBLEM</w:t>
+      </w:r>
+    </w:p>
+    <w:p>
+      <w:pPr>
+        <w:spacing w:after="40"/>
+        <w:ind w:left="240"/>
+      </w:pPr>
+      <w:r>
+        <w:rPr>
+          <w:sz w:val="22"/>
+          <w:szCs w:val="22"/>
+        </w:rPr>
+        <w:t xml:space="preserve">The bigger problem: without a plan, you'll do ten push-ups and call it a day.</w:t>
+      </w:r>
+    </w:p>
+    <w:p>
+      <w:pPr>
+        <w:pBdr>
+          <w:bottom w:val="single" w:color="FFE11A" w:sz="6" w:space="1"/>
+        </w:pBdr>
+        <w:spacing w:after="40" w:before="110"/>
+      </w:pPr>
+      <w:r>
+        <w:rPr>
+          <w:b/>
+          <w:bCs/>
+          <w:color w:val="6B6B6B"/>
+          <w:sz w:val="20"/>
+          <w:szCs w:val="20"/>
+        </w:rPr>
+        <w:t xml:space="preserve">40–55s  </w:t>
+      </w:r>
+      <w:r>
+        <w:rPr>
+          <w:b/>
+          <w:bCs/>
+          <w:sz w:val="22"/>
+          <w:szCs w:val="22"/>
+        </w:rPr>
+        <w:t xml:space="preserve">6 · SOLUTION (close every loop)</w:t>
+      </w:r>
+    </w:p>
+    <w:p>
+      <w:pPr>
+        <w:spacing w:after="40"/>
+        <w:ind w:left="240"/>
+      </w:pPr>
+      <w:r>
+        <w:rPr>
+          <w:sz w:val="22"/>
+          <w:szCs w:val="22"/>
+        </w:rPr>
+        <w:t xml:space="preserve">So here's the plan. Fifteen minutes: squats, push-ups, backpack rows, lunges, plank. Three rounds, each set close to failure.</w:t>
+      </w:r>
+    </w:p>
+    <w:p>
+      <w:pPr>
+        <w:spacing w:after="40"/>
+        <w:ind w:left="240"/>
+      </w:pPr>
+      <w:r>
+        <w:rPr>
+          <w:i/>
+          <w:iCs/>
+          <w:color w:val="6B6B6B"/>
+          <w:sz w:val="18"/>
+          <w:szCs w:val="18"/>
+        </w:rPr>
+        <w:t xml:space="preserve">[Show each exercise for 1–2 s with a counter on screen.]</w:t>
+      </w:r>
+    </w:p>
+    <w:p>
+      <w:pPr>
+        <w:pBdr>
+          <w:bottom w:val="single" w:color="FFE11A" w:sz="6" w:space="1"/>
+        </w:pBdr>
+        <w:spacing w:after="40" w:before="110"/>
+      </w:pPr>
+      <w:r>
+        <w:rPr>
+          <w:b/>
+          <w:bCs/>
+          <w:color w:val="6B6B6B"/>
+          <w:sz w:val="20"/>
+          <w:szCs w:val="20"/>
+        </w:rPr>
+        <w:t xml:space="preserve">55–72s  </w:t>
+      </w:r>
+      <w:r>
+        <w:rPr>
+          <w:b/>
+          <w:bCs/>
+          <w:sz w:val="22"/>
+          <w:szCs w:val="22"/>
+        </w:rPr>
+        <w:t xml:space="preserve">7 · EMOTIONAL CTA (end on hope)</w:t>
       </w:r>
       <w:r>
         <w:rPr>
@@ -5214,41 +5544,28 @@
     </w:p>
     <w:p>
       <w:pPr>
-        <w:spacing w:after="80"/>
-        <w:ind w:left="240"/>
-      </w:pPr>
-      <w:r>
-        <w:rPr>
-          <w:sz w:val="24"/>
-          <w:szCs w:val="24"/>
-        </w:rPr>
-        <w:t xml:space="preserve">Save this for the next rain day.</w:t>
-      </w:r>
-    </w:p>
-    <w:p>
-      <w:pPr>
-        <w:spacing w:after="80"/>
-        <w:ind w:left="240"/>
-      </w:pPr>
-      <w:r>
-        <w:rPr>
-          <w:sz w:val="24"/>
-          <w:szCs w:val="24"/>
-        </w:rPr>
-        <w:t xml:space="preserve">Follow. I make fitness work in real Tamil Nadu weather.</w:t>
-      </w:r>
-    </w:p>
-    <w:p>
-      <w:pPr>
-        <w:spacing w:after="80"/>
-        <w:ind w:left="240"/>
-      </w:pPr>
-      <w:r>
-        <w:rPr>
-          <w:sz w:val="24"/>
-          <w:szCs w:val="24"/>
-        </w:rPr>
-        <w:t xml:space="preserve">Share this with the friend who skips the gym every time it drizzles.</w:t>
+        <w:spacing w:after="40"/>
+        <w:ind w:left="240"/>
+      </w:pPr>
+      <w:r>
+        <w:rPr>
+          <w:sz w:val="22"/>
+          <w:szCs w:val="22"/>
+        </w:rPr>
+        <w:t xml:space="preserve">Eight years of training taught me this: consistency beats perfect conditions. Save this for the next rain day.</w:t>
+      </w:r>
+    </w:p>
+    <w:p>
+      <w:pPr>
+        <w:spacing w:after="40"/>
+        <w:ind w:left="240"/>
+      </w:pPr>
+      <w:r>
+        <w:rPr>
+          <w:sz w:val="22"/>
+          <w:szCs w:val="22"/>
+        </w:rPr>
+        <w:t xml:space="preserve">Send it to the friend who skips the gym every time it drizzles.</w:t>
       </w:r>
     </w:p>
     <w:p>
@@ -5462,7 +5779,7 @@
                 <w:sz w:val="20"/>
                 <w:szCs w:val="20"/>
               </w:rPr>
-              <w:t xml:space="preserve">~42 s spoken in English (101 words). Keep the Tamil delivery under 90 s.</w:t>
+              <w:t xml:space="preserve">~38 s spoken in English (91 words). Keep the Tamil delivery under 90 s.</w:t>
             </w:r>
           </w:p>
         </w:tc>
@@ -5528,7 +5845,7 @@
               </w:rPr>
               <w:t xml:space="preserve">  </w:t>
             </w:r>
-            <w:hyperlink w:history="1" r:id="rId0fsgf7ao7nezjcaabltrb">
+            <w:hyperlink w:history="1" r:id="rIdw_2s09q8xrxem0txoytxq">
               <w:r>
                 <w:rPr>
                   <w:rStyle w:val="Hyperlink"/>
@@ -5547,7 +5864,7 @@
         <w:pBdr>
           <w:bottom w:val="single" w:color="FFE11A" w:sz="6" w:space="1"/>
         </w:pBdr>
-        <w:spacing w:after="80" w:before="200"/>
+        <w:spacing w:after="40" w:before="110"/>
       </w:pPr>
       <w:r>
         <w:rPr>
@@ -5557,16 +5874,16 @@
           <w:sz w:val="20"/>
           <w:szCs w:val="20"/>
         </w:rPr>
-        <w:t xml:space="preserve">0–5s  </w:t>
-      </w:r>
-      <w:r>
-        <w:rPr>
-          <w:b/>
-          <w:bCs/>
-          <w:sz w:val="22"/>
-          <w:szCs w:val="22"/>
-        </w:rPr>
-        <w:t xml:space="preserve">HOOK STACK</w:t>
+        <w:t xml:space="preserve">0–3s  </w:t>
+      </w:r>
+      <w:r>
+        <w:rPr>
+          <w:b/>
+          <w:bCs/>
+          <w:sz w:val="22"/>
+          <w:szCs w:val="22"/>
+        </w:rPr>
+        <w:t xml:space="preserve">1 · HOOK: CURIOSITY</w:t>
       </w:r>
       <w:r>
         <w:rPr>
@@ -5581,7 +5898,7 @@
     </w:p>
     <w:p>
       <w:pPr>
-        <w:spacing w:after="80"/>
+        <w:spacing w:after="40"/>
         <w:ind w:left="240"/>
       </w:pPr>
       <w:r>
@@ -5589,49 +5906,23 @@
           <w:i/>
           <w:iCs/>
           <w:color w:val="6B6B6B"/>
-          <w:sz w:val="19"/>
-          <w:szCs w:val="19"/>
-        </w:rPr>
-        <w:t xml:space="preserve">[Rising SFX.]</w:t>
-      </w:r>
-    </w:p>
-    <w:p>
-      <w:pPr>
-        <w:spacing w:after="80"/>
-        <w:ind w:left="240"/>
-      </w:pPr>
-      <w:r>
-        <w:rPr>
-          <w:sz w:val="24"/>
-          <w:szCs w:val="24"/>
+          <w:sz w:val="18"/>
+          <w:szCs w:val="18"/>
+        </w:rPr>
+        <w:t xml:space="preserve">[Rising SFX starts under the first word.]</w:t>
+      </w:r>
+    </w:p>
+    <w:p>
+      <w:pPr>
+        <w:spacing w:after="40"/>
+        <w:ind w:left="240"/>
+      </w:pPr>
+      <w:r>
+        <w:rPr>
+          <w:sz w:val="22"/>
+          <w:szCs w:val="22"/>
         </w:rPr>
         <w:t xml:space="preserve">Gym pona height valaraadhu.</w:t>
-      </w:r>
-    </w:p>
-    <w:p>
-      <w:pPr>
-        <w:spacing w:after="80"/>
-        <w:ind w:left="240"/>
-      </w:pPr>
-      <w:r>
-        <w:rPr>
-          <w:sz w:val="24"/>
-          <w:szCs w:val="24"/>
-        </w:rPr>
-        <w:t xml:space="preserve">Every relative has said it.</w:t>
-      </w:r>
-    </w:p>
-    <w:p>
-      <w:pPr>
-        <w:spacing w:after="80"/>
-        <w:ind w:left="240"/>
-      </w:pPr>
-      <w:r>
-        <w:rPr>
-          <w:sz w:val="24"/>
-          <w:szCs w:val="24"/>
-        </w:rPr>
-        <w:t xml:space="preserve">Is it true?</w:t>
       </w:r>
     </w:p>
     <w:p>
@@ -5639,7 +5930,7 @@
         <w:pBdr>
           <w:bottom w:val="single" w:color="FFE11A" w:sz="6" w:space="1"/>
         </w:pBdr>
-        <w:spacing w:after="80" w:before="200"/>
+        <w:spacing w:after="40" w:before="110"/>
       </w:pPr>
       <w:r>
         <w:rPr>
@@ -5649,16 +5940,16 @@
           <w:sz w:val="20"/>
           <w:szCs w:val="20"/>
         </w:rPr>
-        <w:t xml:space="preserve">5–7s  </w:t>
-      </w:r>
-      <w:r>
-        <w:rPr>
-          <w:b/>
-          <w:bCs/>
-          <w:sz w:val="22"/>
-          <w:szCs w:val="22"/>
-        </w:rPr>
-        <w:t xml:space="preserve">MEME</w:t>
+        <w:t xml:space="preserve">3–6s  </w:t>
+      </w:r>
+      <w:r>
+        <w:rPr>
+          <w:b/>
+          <w:bCs/>
+          <w:sz w:val="22"/>
+          <w:szCs w:val="22"/>
+        </w:rPr>
+        <w:t xml:space="preserve">1 · HOOK: PATTERN INTERRUPT</w:t>
       </w:r>
       <w:r>
         <w:rPr>
@@ -5673,7 +5964,20 @@
     </w:p>
     <w:p>
       <w:pPr>
-        <w:spacing w:after="80"/>
+        <w:spacing w:after="40"/>
+        <w:ind w:left="240"/>
+      </w:pPr>
+      <w:r>
+        <w:rPr>
+          <w:sz w:val="22"/>
+          <w:szCs w:val="22"/>
+        </w:rPr>
+        <w:t xml:space="preserve">Sports-medicine experts actually support teens lifting.</w:t>
+      </w:r>
+    </w:p>
+    <w:p>
+      <w:pPr>
+        <w:spacing w:after="40"/>
         <w:ind w:left="240"/>
       </w:pPr>
       <w:r>
@@ -5681,10 +5985,10 @@
           <w:i/>
           <w:iCs/>
           <w:color w:val="6B6B6B"/>
-          <w:sz w:val="19"/>
-          <w:szCs w:val="19"/>
-        </w:rPr>
-        <w:t xml:space="preserve">[MEME: relatives giving unsolicited advice at a function.]</w:t>
+          <w:sz w:val="18"/>
+          <w:szCs w:val="18"/>
+        </w:rPr>
+        <w:t xml:space="preserve">[MEME lands on the turn: relatives giving unsolicited advice at a function]</w:t>
       </w:r>
     </w:p>
     <w:p>
@@ -5692,7 +5996,7 @@
         <w:pBdr>
           <w:bottom w:val="single" w:color="FFE11A" w:sz="6" w:space="1"/>
         </w:pBdr>
-        <w:spacing w:after="80" w:before="200"/>
+        <w:spacing w:after="40" w:before="110"/>
       </w:pPr>
       <w:r>
         <w:rPr>
@@ -5702,16 +6006,16 @@
           <w:sz w:val="20"/>
           <w:szCs w:val="20"/>
         </w:rPr>
-        <w:t xml:space="preserve">7–12s  </w:t>
-      </w:r>
-      <w:r>
-        <w:rPr>
-          <w:b/>
-          <w:bCs/>
-          <w:sz w:val="22"/>
-          <w:szCs w:val="22"/>
-        </w:rPr>
-        <w:t xml:space="preserve">AUTHORITY</w:t>
+        <w:t xml:space="preserve">6–13s  </w:t>
+      </w:r>
+      <w:r>
+        <w:rPr>
+          <w:b/>
+          <w:bCs/>
+          <w:sz w:val="22"/>
+          <w:szCs w:val="22"/>
+        </w:rPr>
+        <w:t xml:space="preserve">2 · VALUE (real info by 13 s)</w:t>
       </w:r>
       <w:r>
         <w:rPr>
@@ -5726,15 +6030,47 @@
     </w:p>
     <w:p>
       <w:pPr>
-        <w:spacing w:after="80"/>
-        <w:ind w:left="240"/>
-      </w:pPr>
-      <w:r>
-        <w:rPr>
-          <w:sz w:val="24"/>
-          <w:szCs w:val="24"/>
-        </w:rPr>
-        <w:t xml:space="preserve">Eight years of lifting, and this myth still follows every teen who joins a gym.</w:t>
+        <w:spacing w:after="40"/>
+        <w:ind w:left="240"/>
+      </w:pPr>
+      <w:r>
+        <w:rPr>
+          <w:i/>
+          <w:iCs/>
+          <w:color w:val="6B6B6B"/>
+          <w:sz w:val="18"/>
+          <w:szCs w:val="18"/>
+        </w:rPr>
+        <w:t xml:space="preserve">[CHECK before filming: read the growth-plate section of the position statement and keep the wording within it.]</w:t>
+      </w:r>
+    </w:p>
+    <w:p>
+      <w:pPr>
+        <w:spacing w:after="40"/>
+        <w:ind w:left="240"/>
+      </w:pPr>
+      <w:r>
+        <w:rPr>
+          <w:sz w:val="22"/>
+          <w:szCs w:val="22"/>
+        </w:rPr>
+        <w:t xml:space="preserve">An international consensus of sports-medicine and paediatric experts supports resistance training for kids and teens, when it's supervised and planned for their age.</w:t>
+      </w:r>
+    </w:p>
+    <w:p>
+      <w:pPr>
+        <w:spacing w:after="40"/>
+        <w:ind w:left="240"/>
+      </w:pPr>
+      <w:r>
+        <w:rPr>
+          <w:i/>
+          <w:iCs/>
+          <w:color w:val="6B6B6B"/>
+          <w:sz w:val="18"/>
+          <w:szCs w:val="18"/>
+        </w:rPr>
+        <w:t xml:space="preserve">[ON-SCREEN: Lloyd et al., Br J Sports Med 2014]</w:t>
       </w:r>
     </w:p>
     <w:p>
@@ -5742,7 +6078,7 @@
         <w:pBdr>
           <w:bottom w:val="single" w:color="FFE11A" w:sz="6" w:space="1"/>
         </w:pBdr>
-        <w:spacing w:after="80" w:before="200"/>
+        <w:spacing w:after="40" w:before="110"/>
       </w:pPr>
       <w:r>
         <w:rPr>
@@ -5752,100 +6088,29 @@
           <w:sz w:val="20"/>
           <w:szCs w:val="20"/>
         </w:rPr>
-        <w:t xml:space="preserve">12–48s  </w:t>
-      </w:r>
-      <w:r>
-        <w:rPr>
-          <w:b/>
-          <w:bCs/>
-          <w:sz w:val="22"/>
-          <w:szCs w:val="22"/>
-        </w:rPr>
-        <w:t xml:space="preserve">THE EVIDENCE</w:t>
-      </w:r>
-    </w:p>
-    <w:p>
-      <w:pPr>
-        <w:spacing w:after="80"/>
-        <w:ind w:left="240"/>
-      </w:pPr>
-      <w:r>
-        <w:rPr>
-          <w:i/>
-          <w:iCs/>
-          <w:color w:val="6B6B6B"/>
-          <w:sz w:val="19"/>
-          <w:szCs w:val="19"/>
-        </w:rPr>
-        <w:t xml:space="preserve">[CHECK before filming: read the growth-plate section of the position statement and keep the wording within it.]</w:t>
-      </w:r>
-    </w:p>
-    <w:p>
-      <w:pPr>
-        <w:spacing w:after="80"/>
-        <w:ind w:left="240"/>
-      </w:pPr>
-      <w:r>
-        <w:rPr>
-          <w:sz w:val="24"/>
-          <w:szCs w:val="24"/>
-        </w:rPr>
-        <w:t xml:space="preserve">An international consensus of sports medicine and paediatric experts supports resistance training for kids and teens, when it's supervised and planned for their age.</w:t>
-      </w:r>
-    </w:p>
-    <w:p>
-      <w:pPr>
-        <w:spacing w:after="80"/>
-        <w:ind w:left="240"/>
-      </w:pPr>
-      <w:r>
-        <w:rPr>
-          <w:i/>
-          <w:iCs/>
-          <w:color w:val="6B6B6B"/>
-          <w:sz w:val="19"/>
-          <w:szCs w:val="19"/>
-        </w:rPr>
-        <w:t xml:space="preserve">[ON-SCREEN: Lloyd et al., Br J Sports Med 2014 (International Consensus)]</w:t>
-      </w:r>
-    </w:p>
-    <w:p>
-      <w:pPr>
-        <w:spacing w:after="80"/>
-        <w:ind w:left="240"/>
-      </w:pPr>
-      <w:r>
-        <w:rPr>
-          <w:sz w:val="24"/>
-          <w:szCs w:val="24"/>
-        </w:rPr>
-        <w:t xml:space="preserve">The old fear was growth-plate injuries. Newer research has challenged that fear.</w:t>
-      </w:r>
-    </w:p>
-    <w:p>
-      <w:pPr>
-        <w:spacing w:after="80"/>
-        <w:ind w:left="240"/>
-      </w:pPr>
-      <w:r>
-        <w:rPr>
-          <w:sz w:val="24"/>
-          <w:szCs w:val="24"/>
-        </w:rPr>
-        <w:t xml:space="preserve">So teens can max out deadlifts? No.</w:t>
-      </w:r>
-    </w:p>
-    <w:p>
-      <w:pPr>
-        <w:spacing w:after="80"/>
-        <w:ind w:left="240"/>
-      </w:pPr>
-      <w:r>
-        <w:rPr>
-          <w:sz w:val="24"/>
-          <w:szCs w:val="24"/>
-        </w:rPr>
-        <w:t xml:space="preserve">Supervision. Technique first. Sensible weights. Progress slowly.</w:t>
+        <w:t xml:space="preserve">13–22s  </w:t>
+      </w:r>
+      <w:r>
+        <w:rPr>
+          <w:b/>
+          <w:bCs/>
+          <w:sz w:val="22"/>
+          <w:szCs w:val="22"/>
+        </w:rPr>
+        <w:t xml:space="preserve">3 · FIRST PROBLEM</w:t>
+      </w:r>
+    </w:p>
+    <w:p>
+      <w:pPr>
+        <w:spacing w:after="40"/>
+        <w:ind w:left="240"/>
+      </w:pPr>
+      <w:r>
+        <w:rPr>
+          <w:sz w:val="22"/>
+          <w:szCs w:val="22"/>
+        </w:rPr>
+        <w:t xml:space="preserve">Problem: parents still fear growth-plate injuries.</w:t>
       </w:r>
     </w:p>
     <w:p>
@@ -5853,7 +6118,7 @@
         <w:pBdr>
           <w:bottom w:val="single" w:color="FFE11A" w:sz="6" w:space="1"/>
         </w:pBdr>
-        <w:spacing w:after="80" w:before="200"/>
+        <w:spacing w:after="40" w:before="110"/>
       </w:pPr>
       <w:r>
         <w:rPr>
@@ -5863,16 +6128,136 @@
           <w:sz w:val="20"/>
           <w:szCs w:val="20"/>
         </w:rPr>
-        <w:t xml:space="preserve">48–64s  </w:t>
-      </w:r>
-      <w:r>
-        <w:rPr>
-          <w:b/>
-          <w:bCs/>
-          <w:sz w:val="22"/>
-          <w:szCs w:val="22"/>
-        </w:rPr>
-        <w:t xml:space="preserve">CLOSE + SHARE</w:t>
+        <w:t xml:space="preserve">22–30s  </w:t>
+      </w:r>
+      <w:r>
+        <w:rPr>
+          <w:b/>
+          <w:bCs/>
+          <w:sz w:val="22"/>
+          <w:szCs w:val="22"/>
+        </w:rPr>
+        <w:t xml:space="preserve">4 · FALSE RELIEF (half the fix)</w:t>
+      </w:r>
+    </w:p>
+    <w:p>
+      <w:pPr>
+        <w:spacing w:after="40"/>
+        <w:ind w:left="240"/>
+      </w:pPr>
+      <w:r>
+        <w:rPr>
+          <w:sz w:val="22"/>
+          <w:szCs w:val="22"/>
+        </w:rPr>
+        <w:t xml:space="preserve">Newer research has challenged that fear.</w:t>
+      </w:r>
+    </w:p>
+    <w:p>
+      <w:pPr>
+        <w:pBdr>
+          <w:bottom w:val="single" w:color="FFE11A" w:sz="6" w:space="1"/>
+        </w:pBdr>
+        <w:spacing w:after="40" w:before="110"/>
+      </w:pPr>
+      <w:r>
+        <w:rPr>
+          <w:b/>
+          <w:bCs/>
+          <w:color w:val="6B6B6B"/>
+          <w:sz w:val="20"/>
+          <w:szCs w:val="20"/>
+        </w:rPr>
+        <w:t xml:space="preserve">30–40s  </w:t>
+      </w:r>
+      <w:r>
+        <w:rPr>
+          <w:b/>
+          <w:bCs/>
+          <w:sz w:val="22"/>
+          <w:szCs w:val="22"/>
+        </w:rPr>
+        <w:t xml:space="preserve">5 · SECOND, BIGGER PROBLEM</w:t>
+      </w:r>
+    </w:p>
+    <w:p>
+      <w:pPr>
+        <w:spacing w:after="40"/>
+        <w:ind w:left="240"/>
+      </w:pPr>
+      <w:r>
+        <w:rPr>
+          <w:sz w:val="22"/>
+          <w:szCs w:val="22"/>
+        </w:rPr>
+        <w:t xml:space="preserve">The bigger problem: teens copying max-weight videos online, with no coach and bad form.</w:t>
+      </w:r>
+    </w:p>
+    <w:p>
+      <w:pPr>
+        <w:pBdr>
+          <w:bottom w:val="single" w:color="FFE11A" w:sz="6" w:space="1"/>
+        </w:pBdr>
+        <w:spacing w:after="40" w:before="110"/>
+      </w:pPr>
+      <w:r>
+        <w:rPr>
+          <w:b/>
+          <w:bCs/>
+          <w:color w:val="6B6B6B"/>
+          <w:sz w:val="20"/>
+          <w:szCs w:val="20"/>
+        </w:rPr>
+        <w:t xml:space="preserve">40–55s  </w:t>
+      </w:r>
+      <w:r>
+        <w:rPr>
+          <w:b/>
+          <w:bCs/>
+          <w:sz w:val="22"/>
+          <w:szCs w:val="22"/>
+        </w:rPr>
+        <w:t xml:space="preserve">6 · SOLUTION (close every loop)</w:t>
+      </w:r>
+    </w:p>
+    <w:p>
+      <w:pPr>
+        <w:spacing w:after="40"/>
+        <w:ind w:left="240"/>
+      </w:pPr>
+      <w:r>
+        <w:rPr>
+          <w:sz w:val="22"/>
+          <w:szCs w:val="22"/>
+        </w:rPr>
+        <w:t xml:space="preserve">So: supervision. Technique first. Sensible weights. Slow progress.</w:t>
+      </w:r>
+    </w:p>
+    <w:p>
+      <w:pPr>
+        <w:pBdr>
+          <w:bottom w:val="single" w:color="FFE11A" w:sz="6" w:space="1"/>
+        </w:pBdr>
+        <w:spacing w:after="40" w:before="110"/>
+      </w:pPr>
+      <w:r>
+        <w:rPr>
+          <w:b/>
+          <w:bCs/>
+          <w:color w:val="6B6B6B"/>
+          <w:sz w:val="20"/>
+          <w:szCs w:val="20"/>
+        </w:rPr>
+        <w:t xml:space="preserve">55–72s  </w:t>
+      </w:r>
+      <w:r>
+        <w:rPr>
+          <w:b/>
+          <w:bCs/>
+          <w:sz w:val="22"/>
+          <w:szCs w:val="22"/>
+        </w:rPr>
+        <w:t xml:space="preserve">7 · EMOTIONAL CTA (end on hope)</w:t>
       </w:r>
       <w:r>
         <w:rPr>
@@ -5887,28 +6272,28 @@
     </w:p>
     <w:p>
       <w:pPr>
-        <w:spacing w:after="80"/>
-        <w:ind w:left="240"/>
-      </w:pPr>
-      <w:r>
-        <w:rPr>
-          <w:sz w:val="24"/>
-          <w:szCs w:val="24"/>
-        </w:rPr>
-        <w:t xml:space="preserve">Follow. I bust the myths your relatives forward.</w:t>
-      </w:r>
-    </w:p>
-    <w:p>
-      <w:pPr>
-        <w:spacing w:after="80"/>
-        <w:ind w:left="240"/>
-      </w:pPr>
-      <w:r>
-        <w:rPr>
-          <w:sz w:val="24"/>
-          <w:szCs w:val="24"/>
-        </w:rPr>
-        <w:t xml:space="preserve">Share this with your parents, so your younger brother or sister can start the right way.</w:t>
+        <w:spacing w:after="40"/>
+        <w:ind w:left="240"/>
+      </w:pPr>
+      <w:r>
+        <w:rPr>
+          <w:sz w:val="22"/>
+          <w:szCs w:val="22"/>
+        </w:rPr>
+        <w:t xml:space="preserve">Starting young, the right way, is a gift for life.</w:t>
+      </w:r>
+    </w:p>
+    <w:p>
+      <w:pPr>
+        <w:spacing w:after="40"/>
+        <w:ind w:left="240"/>
+      </w:pPr>
+      <w:r>
+        <w:rPr>
+          <w:sz w:val="22"/>
+          <w:szCs w:val="22"/>
+        </w:rPr>
+        <w:t xml:space="preserve">Send this to your parents, so your younger brother or sister can start right.</w:t>
       </w:r>
     </w:p>
     <w:p>
@@ -6122,7 +6507,7 @@
                 <w:sz w:val="20"/>
                 <w:szCs w:val="20"/>
               </w:rPr>
-              <w:t xml:space="preserve">~48 s spoken in English (118 words). Keep the Tamil delivery under 90 s.</w:t>
+              <w:t xml:space="preserve">~49 s spoken in English (119 words). Keep the Tamil delivery under 90 s.</w:t>
             </w:r>
           </w:p>
         </w:tc>
@@ -6188,7 +6573,7 @@
               </w:rPr>
               <w:t xml:space="preserve">  </w:t>
             </w:r>
-            <w:hyperlink w:history="1" r:id="rIddgekp5rkhc8rc2wfqrbux">
+            <w:hyperlink w:history="1" r:id="rIdgayvaxmtxgcyyvw8sai2l">
               <w:r>
                 <w:rPr>
                   <w:rStyle w:val="Hyperlink"/>
@@ -6207,7 +6592,7 @@
         <w:pBdr>
           <w:bottom w:val="single" w:color="FFE11A" w:sz="6" w:space="1"/>
         </w:pBdr>
-        <w:spacing w:after="80" w:before="200"/>
+        <w:spacing w:after="40" w:before="110"/>
       </w:pPr>
       <w:r>
         <w:rPr>
@@ -6217,16 +6602,16 @@
           <w:sz w:val="20"/>
           <w:szCs w:val="20"/>
         </w:rPr>
-        <w:t xml:space="preserve">0–5s  </w:t>
-      </w:r>
-      <w:r>
-        <w:rPr>
-          <w:b/>
-          <w:bCs/>
-          <w:sz w:val="22"/>
-          <w:szCs w:val="22"/>
-        </w:rPr>
-        <w:t xml:space="preserve">HOOK STACK</w:t>
+        <w:t xml:space="preserve">0–3s  </w:t>
+      </w:r>
+      <w:r>
+        <w:rPr>
+          <w:b/>
+          <w:bCs/>
+          <w:sz w:val="22"/>
+          <w:szCs w:val="22"/>
+        </w:rPr>
+        <w:t xml:space="preserve">1 · HOOK: CURIOSITY</w:t>
       </w:r>
       <w:r>
         <w:rPr>
@@ -6241,7 +6626,7 @@
     </w:p>
     <w:p>
       <w:pPr>
-        <w:spacing w:after="80"/>
+        <w:spacing w:after="40"/>
         <w:ind w:left="240"/>
       </w:pPr>
       <w:r>
@@ -6249,49 +6634,23 @@
           <w:i/>
           <w:iCs/>
           <w:color w:val="6B6B6B"/>
-          <w:sz w:val="19"/>
-          <w:szCs w:val="19"/>
-        </w:rPr>
-        <w:t xml:space="preserve">[Rising SFX.]</w:t>
-      </w:r>
-    </w:p>
-    <w:p>
-      <w:pPr>
-        <w:spacing w:after="80"/>
-        <w:ind w:left="240"/>
-      </w:pPr>
-      <w:r>
-        <w:rPr>
-          <w:sz w:val="24"/>
-          <w:szCs w:val="24"/>
-        </w:rPr>
-        <w:t xml:space="preserve">Diet perfect.</w:t>
-      </w:r>
-    </w:p>
-    <w:p>
-      <w:pPr>
-        <w:spacing w:after="80"/>
-        <w:ind w:left="240"/>
-      </w:pPr>
-      <w:r>
-        <w:rPr>
-          <w:sz w:val="24"/>
-          <w:szCs w:val="24"/>
-        </w:rPr>
-        <w:t xml:space="preserve">Gym perfect.</w:t>
-      </w:r>
-    </w:p>
-    <w:p>
-      <w:pPr>
-        <w:spacing w:after="80"/>
-        <w:ind w:left="240"/>
-      </w:pPr>
-      <w:r>
-        <w:rPr>
-          <w:sz w:val="24"/>
-          <w:szCs w:val="24"/>
-        </w:rPr>
-        <w:t xml:space="preserve">Sleeping five hours? Your fat loss is losing.</w:t>
+          <w:sz w:val="18"/>
+          <w:szCs w:val="18"/>
+        </w:rPr>
+        <w:t xml:space="preserve">[Rising SFX starts under the first word.]</w:t>
+      </w:r>
+    </w:p>
+    <w:p>
+      <w:pPr>
+        <w:spacing w:after="40"/>
+        <w:ind w:left="240"/>
+      </w:pPr>
+      <w:r>
+        <w:rPr>
+          <w:sz w:val="22"/>
+          <w:szCs w:val="22"/>
+        </w:rPr>
+        <w:t xml:space="preserve">Same diet. Same calories.</w:t>
       </w:r>
     </w:p>
     <w:p>
@@ -6299,7 +6658,7 @@
         <w:pBdr>
           <w:bottom w:val="single" w:color="FFE11A" w:sz="6" w:space="1"/>
         </w:pBdr>
-        <w:spacing w:after="80" w:before="200"/>
+        <w:spacing w:after="40" w:before="110"/>
       </w:pPr>
       <w:r>
         <w:rPr>
@@ -6309,16 +6668,16 @@
           <w:sz w:val="20"/>
           <w:szCs w:val="20"/>
         </w:rPr>
-        <w:t xml:space="preserve">5–7s  </w:t>
-      </w:r>
-      <w:r>
-        <w:rPr>
-          <w:b/>
-          <w:bCs/>
-          <w:sz w:val="22"/>
-          <w:szCs w:val="22"/>
-        </w:rPr>
-        <w:t xml:space="preserve">MEME</w:t>
+        <w:t xml:space="preserve">3–6s  </w:t>
+      </w:r>
+      <w:r>
+        <w:rPr>
+          <w:b/>
+          <w:bCs/>
+          <w:sz w:val="22"/>
+          <w:szCs w:val="22"/>
+        </w:rPr>
+        <w:t xml:space="preserve">1 · HOOK: PATTERN INTERRUPT</w:t>
       </w:r>
       <w:r>
         <w:rPr>
@@ -6333,7 +6692,20 @@
     </w:p>
     <w:p>
       <w:pPr>
-        <w:spacing w:after="80"/>
+        <w:spacing w:after="40"/>
+        <w:ind w:left="240"/>
+      </w:pPr>
+      <w:r>
+        <w:rPr>
+          <w:sz w:val="22"/>
+          <w:szCs w:val="22"/>
+        </w:rPr>
+        <w:t xml:space="preserve">One group lost less than half the fat.</w:t>
+      </w:r>
+    </w:p>
+    <w:p>
+      <w:pPr>
+        <w:spacing w:after="40"/>
         <w:ind w:left="240"/>
       </w:pPr>
       <w:r>
@@ -6341,10 +6713,10 @@
           <w:i/>
           <w:iCs/>
           <w:color w:val="6B6B6B"/>
-          <w:sz w:val="19"/>
-          <w:szCs w:val="19"/>
-        </w:rPr>
-        <w:t xml:space="preserve">[MEME: sleepy office worker nodding off, comedy.]</w:t>
+          <w:sz w:val="18"/>
+          <w:szCs w:val="18"/>
+        </w:rPr>
+        <w:t xml:space="preserve">[MEME lands on the turn: a sleepy office worker nodding off]</w:t>
       </w:r>
     </w:p>
     <w:p>
@@ -6352,7 +6724,7 @@
         <w:pBdr>
           <w:bottom w:val="single" w:color="FFE11A" w:sz="6" w:space="1"/>
         </w:pBdr>
-        <w:spacing w:after="80" w:before="200"/>
+        <w:spacing w:after="40" w:before="110"/>
       </w:pPr>
       <w:r>
         <w:rPr>
@@ -6362,16 +6734,16 @@
           <w:sz w:val="20"/>
           <w:szCs w:val="20"/>
         </w:rPr>
-        <w:t xml:space="preserve">7–12s  </w:t>
-      </w:r>
-      <w:r>
-        <w:rPr>
-          <w:b/>
-          <w:bCs/>
-          <w:sz w:val="22"/>
-          <w:szCs w:val="22"/>
-        </w:rPr>
-        <w:t xml:space="preserve">AUTHORITY</w:t>
+        <w:t xml:space="preserve">6–13s  </w:t>
+      </w:r>
+      <w:r>
+        <w:rPr>
+          <w:b/>
+          <w:bCs/>
+          <w:sz w:val="22"/>
+          <w:szCs w:val="22"/>
+        </w:rPr>
+        <w:t xml:space="preserve">2 · VALUE (real info by 13 s)</w:t>
       </w:r>
       <w:r>
         <w:rPr>
@@ -6386,15 +6758,31 @@
     </w:p>
     <w:p>
       <w:pPr>
-        <w:spacing w:after="80"/>
-        <w:ind w:left="240"/>
-      </w:pPr>
-      <w:r>
-        <w:rPr>
-          <w:sz w:val="24"/>
-          <w:szCs w:val="24"/>
-        </w:rPr>
-        <w:t xml:space="preserve">Eight years of training, and the most underrated tool is free.</w:t>
+        <w:spacing w:after="40"/>
+        <w:ind w:left="240"/>
+      </w:pPr>
+      <w:r>
+        <w:rPr>
+          <w:sz w:val="22"/>
+          <w:szCs w:val="22"/>
+        </w:rPr>
+        <w:t xml:space="preserve">Fourteen days of dieting. Sleeping 8.5 hours: 1.4 kilos of fat lost. Sleeping 5.5 hours: 0.6.</w:t>
+      </w:r>
+    </w:p>
+    <w:p>
+      <w:pPr>
+        <w:spacing w:after="40"/>
+        <w:ind w:left="240"/>
+      </w:pPr>
+      <w:r>
+        <w:rPr>
+          <w:i/>
+          <w:iCs/>
+          <w:color w:val="6B6B6B"/>
+          <w:sz w:val="18"/>
+          <w:szCs w:val="18"/>
+        </w:rPr>
+        <w:t xml:space="preserve">[ON-SCREEN: Nedeltcheva et al., Annals of Internal Medicine 2010]</w:t>
       </w:r>
     </w:p>
     <w:p>
@@ -6402,7 +6790,7 @@
         <w:pBdr>
           <w:bottom w:val="single" w:color="FFE11A" w:sz="6" w:space="1"/>
         </w:pBdr>
-        <w:spacing w:after="80" w:before="200"/>
+        <w:spacing w:after="40" w:before="110"/>
       </w:pPr>
       <w:r>
         <w:rPr>
@@ -6412,84 +6800,29 @@
           <w:sz w:val="20"/>
           <w:szCs w:val="20"/>
         </w:rPr>
-        <w:t xml:space="preserve">12–48s  </w:t>
-      </w:r>
-      <w:r>
-        <w:rPr>
-          <w:b/>
-          <w:bCs/>
-          <w:sz w:val="22"/>
-          <w:szCs w:val="22"/>
-        </w:rPr>
-        <w:t xml:space="preserve">THE STUDY</w:t>
-      </w:r>
-    </w:p>
-    <w:p>
-      <w:pPr>
-        <w:spacing w:after="80"/>
-        <w:ind w:left="240"/>
-      </w:pPr>
-      <w:r>
-        <w:rPr>
-          <w:sz w:val="24"/>
-          <w:szCs w:val="24"/>
-        </w:rPr>
-        <w:t xml:space="preserve">In a study, dieters ate the same calories for 14 days, once sleeping 8.5 hours, once sleeping 5.5.</w:t>
-      </w:r>
-    </w:p>
-    <w:p>
-      <w:pPr>
-        <w:spacing w:after="80"/>
-        <w:ind w:left="240"/>
-      </w:pPr>
-      <w:r>
-        <w:rPr>
-          <w:i/>
-          <w:iCs/>
-          <w:color w:val="6B6B6B"/>
-          <w:sz w:val="19"/>
-          <w:szCs w:val="19"/>
-        </w:rPr>
-        <w:t xml:space="preserve">[ON-SCREEN: Nedeltcheva et al., Annals of Internal Medicine 2010]</w:t>
-      </w:r>
-    </w:p>
-    <w:p>
-      <w:pPr>
-        <w:spacing w:after="80"/>
-        <w:ind w:left="240"/>
-      </w:pPr>
-      <w:r>
-        <w:rPr>
-          <w:sz w:val="24"/>
-          <w:szCs w:val="24"/>
-        </w:rPr>
-        <w:t xml:space="preserve">With good sleep they lost 1.4 kg of fat. With short sleep, just 0.6. Same diet.</w:t>
-      </w:r>
-    </w:p>
-    <w:p>
-      <w:pPr>
-        <w:spacing w:after="80"/>
-        <w:ind w:left="240"/>
-      </w:pPr>
-      <w:r>
-        <w:rPr>
-          <w:sz w:val="24"/>
-          <w:szCs w:val="24"/>
-        </w:rPr>
-        <w:t xml:space="preserve">So one bad night ruins everything? No. It was two weeks of short sleep, in a small study of ten people.</w:t>
-      </w:r>
-    </w:p>
-    <w:p>
-      <w:pPr>
-        <w:spacing w:after="80"/>
-        <w:ind w:left="240"/>
-      </w:pPr>
-      <w:r>
-        <w:rPr>
-          <w:sz w:val="24"/>
-          <w:szCs w:val="24"/>
-        </w:rPr>
-        <w:t xml:space="preserve">The fix: a fixed wake-up time, phone away 30 minutes before bed, and no caffeine late in the day.</w:t>
+        <w:t xml:space="preserve">13–22s  </w:t>
+      </w:r>
+      <w:r>
+        <w:rPr>
+          <w:b/>
+          <w:bCs/>
+          <w:sz w:val="22"/>
+          <w:szCs w:val="22"/>
+        </w:rPr>
+        <w:t xml:space="preserve">3 · FIRST PROBLEM</w:t>
+      </w:r>
+    </w:p>
+    <w:p>
+      <w:pPr>
+        <w:spacing w:after="40"/>
+        <w:ind w:left="240"/>
+      </w:pPr>
+      <w:r>
+        <w:rPr>
+          <w:sz w:val="22"/>
+          <w:szCs w:val="22"/>
+        </w:rPr>
+        <w:t xml:space="preserve">Problem: 'I don't have time to sleep eight hours.'</w:t>
       </w:r>
     </w:p>
     <w:p>
@@ -6497,7 +6830,7 @@
         <w:pBdr>
           <w:bottom w:val="single" w:color="FFE11A" w:sz="6" w:space="1"/>
         </w:pBdr>
-        <w:spacing w:after="80" w:before="200"/>
+        <w:spacing w:after="40" w:before="110"/>
       </w:pPr>
       <w:r>
         <w:rPr>
@@ -6507,16 +6840,149 @@
           <w:sz w:val="20"/>
           <w:szCs w:val="20"/>
         </w:rPr>
-        <w:t xml:space="preserve">48–64s  </w:t>
-      </w:r>
-      <w:r>
-        <w:rPr>
-          <w:b/>
-          <w:bCs/>
-          <w:sz w:val="22"/>
-          <w:szCs w:val="22"/>
-        </w:rPr>
-        <w:t xml:space="preserve">CLOSE + SHARE</w:t>
+        <w:t xml:space="preserve">22–30s  </w:t>
+      </w:r>
+      <w:r>
+        <w:rPr>
+          <w:b/>
+          <w:bCs/>
+          <w:sz w:val="22"/>
+          <w:szCs w:val="22"/>
+        </w:rPr>
+        <w:t xml:space="preserve">4 · FALSE RELIEF (half the fix)</w:t>
+      </w:r>
+    </w:p>
+    <w:p>
+      <w:pPr>
+        <w:spacing w:after="40"/>
+        <w:ind w:left="240"/>
+      </w:pPr>
+      <w:r>
+        <w:rPr>
+          <w:sz w:val="22"/>
+          <w:szCs w:val="22"/>
+        </w:rPr>
+        <w:t xml:space="preserve">Start with one fix: the same wake-up time every day.</w:t>
+      </w:r>
+    </w:p>
+    <w:p>
+      <w:pPr>
+        <w:pBdr>
+          <w:bottom w:val="single" w:color="FFE11A" w:sz="6" w:space="1"/>
+        </w:pBdr>
+        <w:spacing w:after="40" w:before="110"/>
+      </w:pPr>
+      <w:r>
+        <w:rPr>
+          <w:b/>
+          <w:bCs/>
+          <w:color w:val="6B6B6B"/>
+          <w:sz w:val="20"/>
+          <w:szCs w:val="20"/>
+        </w:rPr>
+        <w:t xml:space="preserve">30–40s  </w:t>
+      </w:r>
+      <w:r>
+        <w:rPr>
+          <w:b/>
+          <w:bCs/>
+          <w:sz w:val="22"/>
+          <w:szCs w:val="22"/>
+        </w:rPr>
+        <w:t xml:space="preserve">5 · SECOND, BIGGER PROBLEM</w:t>
+      </w:r>
+    </w:p>
+    <w:p>
+      <w:pPr>
+        <w:spacing w:after="40"/>
+        <w:ind w:left="240"/>
+      </w:pPr>
+      <w:r>
+        <w:rPr>
+          <w:sz w:val="22"/>
+          <w:szCs w:val="22"/>
+        </w:rPr>
+        <w:t xml:space="preserve">The bigger problem: phone and caffeine late at night keep pushing your sleep later.</w:t>
+      </w:r>
+    </w:p>
+    <w:p>
+      <w:pPr>
+        <w:pBdr>
+          <w:bottom w:val="single" w:color="FFE11A" w:sz="6" w:space="1"/>
+        </w:pBdr>
+        <w:spacing w:after="40" w:before="110"/>
+      </w:pPr>
+      <w:r>
+        <w:rPr>
+          <w:b/>
+          <w:bCs/>
+          <w:color w:val="6B6B6B"/>
+          <w:sz w:val="20"/>
+          <w:szCs w:val="20"/>
+        </w:rPr>
+        <w:t xml:space="preserve">40–55s  </w:t>
+      </w:r>
+      <w:r>
+        <w:rPr>
+          <w:b/>
+          <w:bCs/>
+          <w:sz w:val="22"/>
+          <w:szCs w:val="22"/>
+        </w:rPr>
+        <w:t xml:space="preserve">6 · SOLUTION (close every loop)</w:t>
+      </w:r>
+    </w:p>
+    <w:p>
+      <w:pPr>
+        <w:spacing w:after="40"/>
+        <w:ind w:left="240"/>
+      </w:pPr>
+      <w:r>
+        <w:rPr>
+          <w:sz w:val="22"/>
+          <w:szCs w:val="22"/>
+        </w:rPr>
+        <w:t xml:space="preserve">So: fixed wake time, phone away 30 minutes before bed, no caffeine late in the day.</w:t>
+      </w:r>
+    </w:p>
+    <w:p>
+      <w:pPr>
+        <w:spacing w:after="40"/>
+        <w:ind w:left="240"/>
+      </w:pPr>
+      <w:r>
+        <w:rPr>
+          <w:sz w:val="22"/>
+          <w:szCs w:val="22"/>
+        </w:rPr>
+        <w:t xml:space="preserve">It was a small study, ten people, so don't panic over one bad night. Just don't make it every night.</w:t>
+      </w:r>
+    </w:p>
+    <w:p>
+      <w:pPr>
+        <w:pBdr>
+          <w:bottom w:val="single" w:color="FFE11A" w:sz="6" w:space="1"/>
+        </w:pBdr>
+        <w:spacing w:after="40" w:before="110"/>
+      </w:pPr>
+      <w:r>
+        <w:rPr>
+          <w:b/>
+          <w:bCs/>
+          <w:color w:val="6B6B6B"/>
+          <w:sz w:val="20"/>
+          <w:szCs w:val="20"/>
+        </w:rPr>
+        <w:t xml:space="preserve">55–72s  </w:t>
+      </w:r>
+      <w:r>
+        <w:rPr>
+          <w:b/>
+          <w:bCs/>
+          <w:sz w:val="22"/>
+          <w:szCs w:val="22"/>
+        </w:rPr>
+        <w:t xml:space="preserve">7 · EMOTIONAL CTA (end on hope)</w:t>
       </w:r>
       <w:r>
         <w:rPr>
@@ -6531,28 +6997,28 @@
     </w:p>
     <w:p>
       <w:pPr>
-        <w:spacing w:after="80"/>
-        <w:ind w:left="240"/>
-      </w:pPr>
-      <w:r>
-        <w:rPr>
-          <w:sz w:val="24"/>
-          <w:szCs w:val="24"/>
-        </w:rPr>
-        <w:t xml:space="preserve">Follow for the boring stuff that actually works.</w:t>
-      </w:r>
-    </w:p>
-    <w:p>
-      <w:pPr>
-        <w:spacing w:after="80"/>
-        <w:ind w:left="240"/>
-      </w:pPr>
-      <w:r>
-        <w:rPr>
-          <w:sz w:val="24"/>
-          <w:szCs w:val="24"/>
-        </w:rPr>
-        <w:t xml:space="preserve">Share this with the friend who replies to your messages at 2 am.</w:t>
+        <w:spacing w:after="40"/>
+        <w:ind w:left="240"/>
+      </w:pPr>
+      <w:r>
+        <w:rPr>
+          <w:sz w:val="22"/>
+          <w:szCs w:val="22"/>
+        </w:rPr>
+        <w:t xml:space="preserve">Rest is part of the plan, not a break from it.</w:t>
+      </w:r>
+    </w:p>
+    <w:p>
+      <w:pPr>
+        <w:spacing w:after="40"/>
+        <w:ind w:left="240"/>
+      </w:pPr>
+      <w:r>
+        <w:rPr>
+          <w:sz w:val="22"/>
+          <w:szCs w:val="22"/>
+        </w:rPr>
+        <w:t xml:space="preserve">Send this to the friend replying to messages at 2 am.</w:t>
       </w:r>
     </w:p>
     <w:sectPr>

</xml_diff>